<commit_message>
Updated on March 25
</commit_message>
<xml_diff>
--- a/Assignment/NFS1218_Pediatric Nutrition Pipeline.docx
+++ b/Assignment/NFS1218_Pediatric Nutrition Pipeline.docx
@@ -242,13 +242,52 @@
               <w:rPr>
                 <w:rFonts w:ascii="Calibri" w:hAnsi="Calibri" w:cs="Calibri"/>
               </w:rPr>
-              <w:t>: Are maternal dietary, socioeconomic, and clinical factors associated with early childhood growth trajectories based on BMI-for-age z scores (zBMI)?</w:t>
-            </w:r>
-          </w:p>
-          <w:p>
-            <w:pPr>
-              <w:rPr>
-                <w:rFonts w:ascii="Calibri" w:hAnsi="Calibri" w:cs="Calibri"/>
+              <w:t xml:space="preserve">: </w:t>
+            </w:r>
+          </w:p>
+          <w:p>
+            <w:pPr>
+              <w:rPr>
+                <w:rFonts w:ascii="Calibri" w:hAnsi="Calibri" w:cs="Calibri"/>
+              </w:rPr>
+            </w:pPr>
+            <w:r>
+              <w:rPr>
+                <w:rFonts w:ascii="Calibri" w:hAnsi="Calibri" w:cs="Calibri"/>
+              </w:rPr>
+              <w:t xml:space="preserve">Are maternal dietary and socioeconomic factors associated with early childhood growth trajectories, as defined by </w:t>
+            </w:r>
+            <w:r>
+              <w:rPr>
+                <w:rFonts w:ascii="Calibri" w:hAnsi="Calibri" w:cs="Calibri"/>
+              </w:rPr>
+              <w:t xml:space="preserve">BMI-for-age z scores </w:t>
+            </w:r>
+            <w:r>
+              <w:rPr>
+                <w:rFonts w:ascii="Calibri" w:hAnsi="Calibri" w:cs="Calibri"/>
+              </w:rPr>
+              <w:t>(zBMI)-based cluster patterns at 24 month</w:t>
+            </w:r>
+            <w:r>
+              <w:rPr>
+                <w:rFonts w:ascii="Calibri" w:hAnsi="Calibri" w:cs="Calibri"/>
+              </w:rPr>
+              <w:t xml:space="preserve"> of age</w:t>
+            </w:r>
+            <w:r>
+              <w:rPr>
+                <w:rFonts w:ascii="Calibri" w:hAnsi="Calibri" w:cs="Calibri"/>
+              </w:rPr>
+              <w:t>?</w:t>
+            </w:r>
+          </w:p>
+          <w:p>
+            <w:pPr>
+              <w:rPr>
+                <w:rFonts w:ascii="Calibri" w:hAnsi="Calibri" w:cs="Calibri"/>
+                <w:b/>
+                <w:bCs/>
               </w:rPr>
             </w:pPr>
             <w:r>
@@ -259,6 +298,13 @@
               </w:rPr>
               <w:t xml:space="preserve">Population: </w:t>
             </w:r>
+          </w:p>
+          <w:p>
+            <w:pPr>
+              <w:rPr>
+                <w:rFonts w:ascii="Calibri" w:hAnsi="Calibri" w:cs="Calibri"/>
+              </w:rPr>
+            </w:pPr>
             <w:r>
               <w:rPr>
                 <w:rFonts w:ascii="Calibri" w:hAnsi="Calibri" w:cs="Calibri"/>
@@ -310,13 +356,50 @@
               <w:rPr>
                 <w:rFonts w:ascii="Calibri" w:hAnsi="Calibri" w:cs="Calibri"/>
               </w:rPr>
-              <w:t>: Maternal dietary factors, socioeconomic factors, clinical biomarkers</w:t>
-            </w:r>
-            <w:r>
-              <w:rPr>
-                <w:rFonts w:ascii="Calibri" w:hAnsi="Calibri" w:cs="Calibri"/>
-              </w:rPr>
-              <w:t>, and gut microbiome</w:t>
+              <w:t xml:space="preserve">: </w:t>
+            </w:r>
+          </w:p>
+          <w:p>
+            <w:pPr>
+              <w:rPr>
+                <w:rFonts w:ascii="Calibri" w:hAnsi="Calibri" w:cs="Calibri"/>
+              </w:rPr>
+            </w:pPr>
+            <w:r>
+              <w:rPr>
+                <w:rFonts w:ascii="Calibri" w:hAnsi="Calibri" w:cs="Calibri"/>
+              </w:rPr>
+              <w:t>Maternal u</w:t>
+            </w:r>
+            <w:r>
+              <w:rPr>
+                <w:rFonts w:ascii="Calibri" w:hAnsi="Calibri" w:cs="Calibri"/>
+              </w:rPr>
+              <w:t>ltra-processed food</w:t>
+            </w:r>
+            <w:r>
+              <w:rPr>
+                <w:rFonts w:ascii="Calibri" w:hAnsi="Calibri" w:cs="Calibri"/>
+              </w:rPr>
+              <w:t xml:space="preserve"> </w:t>
+            </w:r>
+            <w:r>
+              <w:rPr>
+                <w:rFonts w:ascii="Calibri" w:hAnsi="Calibri" w:cs="Calibri"/>
+              </w:rPr>
+              <w:t xml:space="preserve">(UPF) </w:t>
+            </w:r>
+            <w:r>
+              <w:rPr>
+                <w:rFonts w:ascii="Calibri" w:hAnsi="Calibri" w:cs="Calibri"/>
+              </w:rPr>
+              <w:t>consumption, total energy intake (kcal), and household income</w:t>
+            </w:r>
+            <w:r>
+              <w:rPr>
+                <w:rFonts w:ascii="Calibri" w:hAnsi="Calibri" w:cs="Calibri"/>
+              </w:rPr>
+              <w:t>.</w:t>
             </w:r>
           </w:p>
           <w:p>
@@ -337,7 +420,32 @@
               <w:rPr>
                 <w:rFonts w:ascii="Calibri" w:hAnsi="Calibri" w:cs="Calibri"/>
               </w:rPr>
-              <w:t>: zBMI trajectory clusters</w:t>
+              <w:t xml:space="preserve">: </w:t>
+            </w:r>
+          </w:p>
+          <w:p>
+            <w:pPr>
+              <w:rPr>
+                <w:rFonts w:ascii="Calibri" w:hAnsi="Calibri" w:cs="Calibri"/>
+              </w:rPr>
+            </w:pPr>
+            <w:r>
+              <w:rPr>
+                <w:rFonts w:ascii="Calibri" w:hAnsi="Calibri" w:cs="Calibri"/>
+              </w:rPr>
+              <w:t>zBMI trajectory clusters</w:t>
+            </w:r>
+            <w:r>
+              <w:rPr>
+                <w:rFonts w:ascii="Calibri" w:hAnsi="Calibri" w:cs="Calibri"/>
+              </w:rPr>
+              <w:t xml:space="preserve"> among children</w:t>
+            </w:r>
+            <w:r>
+              <w:rPr>
+                <w:rFonts w:ascii="Calibri" w:hAnsi="Calibri" w:cs="Calibri"/>
+              </w:rPr>
+              <w:t>.</w:t>
             </w:r>
           </w:p>
         </w:tc>
@@ -393,19 +501,249 @@
               <w:rPr>
                 <w:rFonts w:ascii="Calibri" w:hAnsi="Calibri" w:cs="Calibri"/>
               </w:rPr>
-              <w:t>I</w:t>
-            </w:r>
-            <w:r>
-              <w:rPr>
-                <w:rFonts w:ascii="Calibri" w:hAnsi="Calibri" w:cs="Calibri"/>
-              </w:rPr>
-              <w:t xml:space="preserve">nadequate nutrition </w:t>
-            </w:r>
-            <w:r>
-              <w:rPr>
-                <w:rFonts w:ascii="Calibri" w:hAnsi="Calibri" w:cs="Calibri"/>
-              </w:rPr>
-              <w:t>during early childhood is associated with malnutrition and increased risk of later-life disease development.</w:t>
+              <w:t>Early childhood represents a critical window for growth and metabolic programming, during which nutritional adequacy exert</w:t>
+            </w:r>
+            <w:r>
+              <w:rPr>
+                <w:rFonts w:ascii="Calibri" w:hAnsi="Calibri" w:cs="Calibri"/>
+              </w:rPr>
+              <w:t>s</w:t>
+            </w:r>
+            <w:r>
+              <w:rPr>
+                <w:rFonts w:ascii="Calibri" w:hAnsi="Calibri" w:cs="Calibri"/>
+              </w:rPr>
+              <w:t xml:space="preserve"> influences on long-term health trajectories. Inadequate or excess nutrition during this period is associated with </w:t>
+            </w:r>
+            <w:r>
+              <w:rPr>
+                <w:rFonts w:ascii="Calibri" w:hAnsi="Calibri" w:cs="Calibri"/>
+              </w:rPr>
+              <w:t xml:space="preserve">malnutrition or accelerated </w:t>
+            </w:r>
+            <w:r>
+              <w:rPr>
+                <w:rFonts w:ascii="Calibri" w:hAnsi="Calibri" w:cs="Calibri"/>
+              </w:rPr>
+              <w:t xml:space="preserve">risks in metabolic diseases </w:t>
+            </w:r>
+            <w:r>
+              <w:rPr>
+                <w:rFonts w:ascii="Calibri" w:hAnsi="Calibri" w:cs="Calibri"/>
+              </w:rPr>
+              <w:t xml:space="preserve">later in life. </w:t>
+            </w:r>
+            <w:r>
+              <w:rPr>
+                <w:rFonts w:ascii="Calibri" w:hAnsi="Calibri" w:cs="Calibri"/>
+              </w:rPr>
+              <w:t xml:space="preserve">Identifying </w:t>
+            </w:r>
+            <w:r>
+              <w:rPr>
+                <w:rFonts w:ascii="Calibri" w:hAnsi="Calibri" w:cs="Calibri"/>
+              </w:rPr>
+              <w:t xml:space="preserve">factors associated with </w:t>
+            </w:r>
+            <w:r>
+              <w:rPr>
+                <w:rFonts w:ascii="Calibri" w:hAnsi="Calibri" w:cs="Calibri"/>
+              </w:rPr>
+              <w:t xml:space="preserve">early-life growth patterns could help identify children at risk of </w:t>
+            </w:r>
+            <w:r>
+              <w:rPr>
+                <w:rFonts w:ascii="Calibri" w:hAnsi="Calibri" w:cs="Calibri"/>
+              </w:rPr>
+              <w:t xml:space="preserve">adverse health outcomes and </w:t>
+            </w:r>
+            <w:r>
+              <w:rPr>
+                <w:rFonts w:ascii="Calibri" w:hAnsi="Calibri" w:cs="Calibri"/>
+              </w:rPr>
+              <w:t>inform the</w:t>
+            </w:r>
+            <w:r>
+              <w:rPr>
+                <w:rFonts w:ascii="Calibri" w:hAnsi="Calibri" w:cs="Calibri"/>
+              </w:rPr>
+              <w:t xml:space="preserve"> develop</w:t>
+            </w:r>
+            <w:r>
+              <w:rPr>
+                <w:rFonts w:ascii="Calibri" w:hAnsi="Calibri" w:cs="Calibri"/>
+              </w:rPr>
+              <w:t>ment of</w:t>
+            </w:r>
+            <w:r>
+              <w:rPr>
+                <w:rFonts w:ascii="Calibri" w:hAnsi="Calibri" w:cs="Calibri"/>
+              </w:rPr>
+              <w:t xml:space="preserve"> public health and clinical guidelines.</w:t>
+            </w:r>
+            <w:r>
+              <w:rPr>
+                <w:rFonts w:ascii="Calibri" w:hAnsi="Calibri" w:cs="Calibri"/>
+              </w:rPr>
+              <w:t xml:space="preserve"> Growth trajectory assessments is</w:t>
+            </w:r>
+            <w:r>
+              <w:rPr>
+                <w:rFonts w:ascii="Calibri" w:hAnsi="Calibri" w:cs="Calibri"/>
+              </w:rPr>
+              <w:t xml:space="preserve"> therefore an important analytic tool</w:t>
+            </w:r>
+            <w:r>
+              <w:rPr>
+                <w:rFonts w:ascii="Calibri" w:hAnsi="Calibri" w:cs="Calibri"/>
+              </w:rPr>
+              <w:t xml:space="preserve">. However, the heterogeneity of early childhood </w:t>
+            </w:r>
+            <w:r>
+              <w:rPr>
+                <w:rFonts w:ascii="Calibri" w:hAnsi="Calibri" w:cs="Calibri"/>
+              </w:rPr>
+              <w:t xml:space="preserve">growth </w:t>
+            </w:r>
+            <w:r>
+              <w:rPr>
+                <w:rFonts w:ascii="Calibri" w:hAnsi="Calibri" w:cs="Calibri"/>
+              </w:rPr>
+              <w:t>patterns often limit</w:t>
+            </w:r>
+            <w:r>
+              <w:rPr>
+                <w:rFonts w:ascii="Calibri" w:hAnsi="Calibri" w:cs="Calibri"/>
+              </w:rPr>
+              <w:t>s</w:t>
+            </w:r>
+            <w:r>
+              <w:rPr>
+                <w:rFonts w:ascii="Calibri" w:hAnsi="Calibri" w:cs="Calibri"/>
+              </w:rPr>
+              <w:t xml:space="preserve"> the ability to </w:t>
+            </w:r>
+            <w:r>
+              <w:rPr>
+                <w:rFonts w:ascii="Calibri" w:hAnsi="Calibri" w:cs="Calibri"/>
+              </w:rPr>
+              <w:t xml:space="preserve">detect meaningful subgroups, and </w:t>
+            </w:r>
+            <w:r>
+              <w:rPr>
+                <w:rFonts w:ascii="Calibri" w:hAnsi="Calibri" w:cs="Calibri"/>
+              </w:rPr>
+              <w:t xml:space="preserve">a data-driven framework capable of capturing </w:t>
+            </w:r>
+            <w:r>
+              <w:rPr>
+                <w:rFonts w:ascii="Calibri" w:hAnsi="Calibri" w:cs="Calibri"/>
+              </w:rPr>
+              <w:t>this</w:t>
+            </w:r>
+            <w:r>
+              <w:rPr>
+                <w:rFonts w:ascii="Calibri" w:hAnsi="Calibri" w:cs="Calibri"/>
+              </w:rPr>
+              <w:t xml:space="preserve"> heterogeneity is needed. </w:t>
+            </w:r>
+          </w:p>
+          <w:p>
+            <w:pPr>
+              <w:rPr>
+                <w:rFonts w:ascii="Calibri" w:hAnsi="Calibri" w:cs="Calibri"/>
+              </w:rPr>
+            </w:pPr>
+          </w:p>
+          <w:p>
+            <w:pPr>
+              <w:rPr>
+                <w:rFonts w:ascii="Calibri" w:hAnsi="Calibri" w:cs="Calibri"/>
+              </w:rPr>
+            </w:pPr>
+            <w:r>
+              <w:rPr>
+                <w:rFonts w:ascii="Calibri" w:hAnsi="Calibri" w:cs="Calibri"/>
+              </w:rPr>
+              <w:t>Maternal factors, including dietary quality, energy intake, and socioeconomic status</w:t>
+            </w:r>
+            <w:r>
+              <w:rPr>
+                <w:rFonts w:ascii="Calibri" w:hAnsi="Calibri" w:cs="Calibri"/>
+              </w:rPr>
+              <w:t xml:space="preserve">, have been shown to affect infant growth. However, the degree to which these factors shape the </w:t>
+            </w:r>
+            <w:r>
+              <w:rPr>
+                <w:rFonts w:ascii="Calibri" w:hAnsi="Calibri" w:cs="Calibri"/>
+              </w:rPr>
+              <w:t>children’s</w:t>
+            </w:r>
+            <w:r>
+              <w:rPr>
+                <w:rFonts w:ascii="Calibri" w:hAnsi="Calibri" w:cs="Calibri"/>
+              </w:rPr>
+              <w:t xml:space="preserve"> growth trajectories in the first 24 months of life remains incompletely understood. </w:t>
+            </w:r>
+            <w:r>
+              <w:rPr>
+                <w:rFonts w:ascii="Calibri" w:hAnsi="Calibri" w:cs="Calibri"/>
+              </w:rPr>
+              <w:t>The proposed approach examine</w:t>
+            </w:r>
+            <w:r>
+              <w:rPr>
+                <w:rFonts w:ascii="Calibri" w:hAnsi="Calibri" w:cs="Calibri"/>
+              </w:rPr>
+              <w:t>s</w:t>
+            </w:r>
+            <w:r>
+              <w:rPr>
+                <w:rFonts w:ascii="Calibri" w:hAnsi="Calibri" w:cs="Calibri"/>
+              </w:rPr>
+              <w:t xml:space="preserve"> the maternal factors, including </w:t>
+            </w:r>
+            <w:r>
+              <w:rPr>
+                <w:rFonts w:ascii="Calibri" w:hAnsi="Calibri" w:cs="Calibri"/>
+              </w:rPr>
+              <w:t xml:space="preserve">UPF </w:t>
+            </w:r>
+            <w:r>
+              <w:rPr>
+                <w:rFonts w:ascii="Calibri" w:hAnsi="Calibri" w:cs="Calibri"/>
+              </w:rPr>
+              <w:t xml:space="preserve">consumption, </w:t>
+            </w:r>
+            <w:r>
+              <w:rPr>
+                <w:rFonts w:ascii="Calibri" w:hAnsi="Calibri" w:cs="Calibri"/>
+              </w:rPr>
+              <w:t xml:space="preserve">total </w:t>
+            </w:r>
+            <w:r>
+              <w:rPr>
+                <w:rFonts w:ascii="Calibri" w:hAnsi="Calibri" w:cs="Calibri"/>
+              </w:rPr>
+              <w:t>energy intake, and household income</w:t>
+            </w:r>
+            <w:r>
+              <w:rPr>
+                <w:rFonts w:ascii="Calibri" w:hAnsi="Calibri" w:cs="Calibri"/>
+              </w:rPr>
+              <w:t>,</w:t>
+            </w:r>
+            <w:r>
+              <w:rPr>
+                <w:rFonts w:ascii="Calibri" w:hAnsi="Calibri" w:cs="Calibri"/>
+              </w:rPr>
+              <w:t xml:space="preserve"> as modifiable and measurable </w:t>
+            </w:r>
+            <w:r>
+              <w:rPr>
+                <w:rFonts w:ascii="Calibri" w:hAnsi="Calibri" w:cs="Calibri"/>
+              </w:rPr>
+              <w:t>predictors</w:t>
             </w:r>
             <w:r>
               <w:rPr>
@@ -417,38 +755,49 @@
               <w:rPr>
                 <w:rFonts w:ascii="Calibri" w:hAnsi="Calibri" w:cs="Calibri"/>
               </w:rPr>
-              <w:t>Identifying maternal factors (dietary, socioeconomic, clinical biomarkers</w:t>
-            </w:r>
-            <w:r>
-              <w:rPr>
-                <w:rFonts w:ascii="Calibri" w:hAnsi="Calibri" w:cs="Calibri"/>
-              </w:rPr>
-              <w:t>, gut microbiome</w:t>
-            </w:r>
-            <w:r>
-              <w:rPr>
-                <w:rFonts w:ascii="Calibri" w:hAnsi="Calibri" w:cs="Calibri"/>
-              </w:rPr>
-              <w:t xml:space="preserve">) that associate with early-life growth patterns could help identify children at risk of malnutrition and later-life adverse health outcomes and help in developing public health and clinical guidelines. </w:t>
-            </w:r>
-          </w:p>
-          <w:p>
-            <w:pPr>
-              <w:rPr>
-                <w:rFonts w:ascii="Calibri" w:hAnsi="Calibri" w:cs="Calibri"/>
-              </w:rPr>
-            </w:pPr>
-            <w:r>
-              <w:rPr>
-                <w:rFonts w:ascii="Calibri" w:hAnsi="Calibri" w:cs="Calibri"/>
-              </w:rPr>
-              <w:t>The proposed approach is to use zBMI, adjusted for age and sex</w:t>
-            </w:r>
-            <w:r>
-              <w:rPr>
-                <w:rFonts w:ascii="Calibri" w:hAnsi="Calibri" w:cs="Calibri"/>
-              </w:rPr>
-              <w:t xml:space="preserve"> according to WHO growth standards</w:t>
+              <w:t>of</w:t>
+            </w:r>
+            <w:r>
+              <w:rPr>
+                <w:rFonts w:ascii="Calibri" w:hAnsi="Calibri" w:cs="Calibri"/>
+              </w:rPr>
+              <w:t xml:space="preserve"> heterogeneous growth patterns</w:t>
+            </w:r>
+            <w:r>
+              <w:rPr>
+                <w:rFonts w:ascii="Calibri" w:hAnsi="Calibri" w:cs="Calibri"/>
+              </w:rPr>
+              <w:t xml:space="preserve">. By </w:t>
+            </w:r>
+            <w:r>
+              <w:rPr>
+                <w:rFonts w:ascii="Calibri" w:hAnsi="Calibri" w:cs="Calibri"/>
+              </w:rPr>
+              <w:t>group</w:t>
+            </w:r>
+            <w:r>
+              <w:rPr>
+                <w:rFonts w:ascii="Calibri" w:hAnsi="Calibri" w:cs="Calibri"/>
+              </w:rPr>
+              <w:t>ing</w:t>
+            </w:r>
+            <w:r>
+              <w:rPr>
+                <w:rFonts w:ascii="Calibri" w:hAnsi="Calibri" w:cs="Calibri"/>
+              </w:rPr>
+              <w:t xml:space="preserve"> children </w:t>
+            </w:r>
+            <w:r>
+              <w:rPr>
+                <w:rFonts w:ascii="Calibri" w:hAnsi="Calibri" w:cs="Calibri"/>
+              </w:rPr>
+              <w:t>according to similar</w:t>
+            </w:r>
+            <w:r>
+              <w:rPr>
+                <w:rFonts w:ascii="Calibri" w:hAnsi="Calibri" w:cs="Calibri"/>
+              </w:rPr>
+              <w:t xml:space="preserve"> growth patterns</w:t>
             </w:r>
             <w:r>
               <w:rPr>
@@ -460,66 +809,63 @@
               <w:rPr>
                 <w:rFonts w:ascii="Calibri" w:hAnsi="Calibri" w:cs="Calibri"/>
               </w:rPr>
-              <w:t>to identify heterogeneous growth patterns and group children by similar growth patterns.</w:t>
-            </w:r>
-            <w:r>
-              <w:rPr>
-                <w:rFonts w:ascii="Calibri" w:hAnsi="Calibri" w:cs="Calibri"/>
-              </w:rPr>
-              <w:t xml:space="preserve"> Through </w:t>
-            </w:r>
-            <w:r>
-              <w:rPr>
-                <w:rFonts w:ascii="Calibri" w:hAnsi="Calibri" w:cs="Calibri"/>
-              </w:rPr>
-              <w:t>this</w:t>
-            </w:r>
-            <w:r>
-              <w:rPr>
-                <w:rFonts w:ascii="Calibri" w:hAnsi="Calibri" w:cs="Calibri"/>
-              </w:rPr>
-              <w:t xml:space="preserve">, we could design targeted disease prevention strategies and promote healthy dietary </w:t>
-            </w:r>
-            <w:r>
-              <w:rPr>
-                <w:rFonts w:ascii="Calibri" w:hAnsi="Calibri" w:cs="Calibri"/>
-              </w:rPr>
-              <w:t>practices</w:t>
-            </w:r>
-            <w:r>
-              <w:rPr>
-                <w:rFonts w:ascii="Calibri" w:hAnsi="Calibri" w:cs="Calibri"/>
-              </w:rPr>
-              <w:t xml:space="preserve"> </w:t>
-            </w:r>
-            <w:r>
-              <w:rPr>
-                <w:rFonts w:ascii="Calibri" w:hAnsi="Calibri" w:cs="Calibri"/>
-              </w:rPr>
-              <w:t xml:space="preserve">during gestation and </w:t>
-            </w:r>
-            <w:r>
-              <w:rPr>
-                <w:rFonts w:ascii="Calibri" w:hAnsi="Calibri" w:cs="Calibri"/>
-              </w:rPr>
-              <w:t>early life.</w:t>
-            </w:r>
-          </w:p>
-          <w:p>
-            <w:pPr>
-              <w:rPr>
-                <w:rFonts w:ascii="Calibri" w:hAnsi="Calibri" w:cs="Calibri"/>
-                <w:b/>
-                <w:bCs/>
-              </w:rPr>
-            </w:pPr>
-            <w:r>
-              <w:rPr>
-                <w:rFonts w:ascii="Calibri" w:hAnsi="Calibri" w:cs="Calibri"/>
-                <w:b/>
-                <w:bCs/>
-              </w:rPr>
-              <w:t>Expected benefits:</w:t>
+              <w:t>our framework support</w:t>
+            </w:r>
+            <w:r>
+              <w:rPr>
+                <w:rFonts w:ascii="Calibri" w:hAnsi="Calibri" w:cs="Calibri"/>
+              </w:rPr>
+              <w:t>s the</w:t>
+            </w:r>
+            <w:r>
+              <w:rPr>
+                <w:rFonts w:ascii="Calibri" w:hAnsi="Calibri" w:cs="Calibri"/>
+              </w:rPr>
+              <w:t xml:space="preserve"> targeted disease prevention strategies and promote healthy dietary practices during gestation and early life.</w:t>
+            </w:r>
+          </w:p>
+          <w:p>
+            <w:pPr>
+              <w:rPr>
+                <w:rFonts w:ascii="Calibri" w:hAnsi="Calibri" w:cs="Calibri"/>
+              </w:rPr>
+            </w:pPr>
+          </w:p>
+          <w:p>
+            <w:pPr>
+              <w:rPr>
+                <w:rFonts w:ascii="Calibri" w:hAnsi="Calibri" w:cs="Calibri"/>
+              </w:rPr>
+            </w:pPr>
+            <w:r>
+              <w:rPr>
+                <w:rFonts w:ascii="Calibri" w:hAnsi="Calibri" w:cs="Calibri"/>
+                <w:b/>
+                <w:bCs/>
+              </w:rPr>
+              <w:t xml:space="preserve">Expected </w:t>
+            </w:r>
+            <w:r>
+              <w:rPr>
+                <w:rFonts w:ascii="Calibri" w:hAnsi="Calibri" w:cs="Calibri"/>
+                <w:b/>
+                <w:bCs/>
+              </w:rPr>
+              <w:t>B</w:t>
+            </w:r>
+            <w:r>
+              <w:rPr>
+                <w:rFonts w:ascii="Calibri" w:hAnsi="Calibri" w:cs="Calibri"/>
+                <w:b/>
+                <w:bCs/>
+              </w:rPr>
+              <w:t>enefits</w:t>
+            </w:r>
+            <w:r>
+              <w:rPr>
+                <w:rFonts w:ascii="Calibri" w:hAnsi="Calibri" w:cs="Calibri"/>
+              </w:rPr>
+              <w:t>:</w:t>
             </w:r>
           </w:p>
           <w:p>
@@ -527,18 +873,76 @@
               <w:pStyle w:val="ListParagraph"/>
               <w:numPr>
                 <w:ilvl w:val="0"/>
-                <w:numId w:val="5"/>
+                <w:numId w:val="20"/>
               </w:numPr>
-              <w:spacing w:line="276" w:lineRule="auto"/>
-              <w:rPr>
-                <w:rFonts w:ascii="Calibri" w:hAnsi="Calibri" w:cs="Calibri"/>
-              </w:rPr>
-            </w:pPr>
-            <w:r>
-              <w:rPr>
-                <w:rFonts w:ascii="Calibri" w:hAnsi="Calibri" w:cs="Calibri"/>
-              </w:rPr>
-              <w:t>Better understand how maternal diet and socioeconomic factors influence growth</w:t>
+              <w:rPr>
+                <w:rFonts w:ascii="Calibri" w:hAnsi="Calibri" w:cs="Calibri"/>
+              </w:rPr>
+            </w:pPr>
+            <w:r>
+              <w:rPr>
+                <w:rFonts w:ascii="Calibri" w:hAnsi="Calibri" w:cs="Calibri"/>
+                <w:b/>
+                <w:bCs/>
+              </w:rPr>
+              <w:t>Understanding</w:t>
+            </w:r>
+            <w:r>
+              <w:rPr>
+                <w:rFonts w:ascii="Calibri" w:hAnsi="Calibri" w:cs="Calibri"/>
+                <w:b/>
+                <w:bCs/>
+              </w:rPr>
+              <w:t xml:space="preserve"> maternal exposures to child growth profiles</w:t>
+            </w:r>
+            <w:r>
+              <w:rPr>
+                <w:rFonts w:ascii="Calibri" w:hAnsi="Calibri" w:cs="Calibri"/>
+              </w:rPr>
+              <w:t xml:space="preserve">: </w:t>
+            </w:r>
+            <w:r>
+              <w:rPr>
+                <w:rFonts w:ascii="Calibri" w:hAnsi="Calibri" w:cs="Calibri"/>
+              </w:rPr>
+              <w:t>E</w:t>
+            </w:r>
+            <w:r>
+              <w:rPr>
+                <w:rFonts w:ascii="Calibri" w:hAnsi="Calibri" w:cs="Calibri"/>
+              </w:rPr>
+              <w:t xml:space="preserve">xamining </w:t>
+            </w:r>
+            <w:r>
+              <w:rPr>
+                <w:rFonts w:ascii="Calibri" w:hAnsi="Calibri" w:cs="Calibri"/>
+              </w:rPr>
+              <w:t xml:space="preserve">trajectory clusters of </w:t>
+            </w:r>
+            <w:r>
+              <w:rPr>
+                <w:rFonts w:ascii="Calibri" w:hAnsi="Calibri" w:cs="Calibri"/>
+              </w:rPr>
+              <w:t xml:space="preserve">maternal dietary </w:t>
+            </w:r>
+            <w:r>
+              <w:rPr>
+                <w:rFonts w:ascii="Calibri" w:hAnsi="Calibri" w:cs="Calibri"/>
+              </w:rPr>
+              <w:t xml:space="preserve">(UPF intake, total energy intake) and socioeconomic </w:t>
+            </w:r>
+            <w:r>
+              <w:rPr>
+                <w:rFonts w:ascii="Calibri" w:hAnsi="Calibri" w:cs="Calibri"/>
+              </w:rPr>
+              <w:lastRenderedPageBreak/>
+              <w:t xml:space="preserve">(household income) factors </w:t>
+            </w:r>
+            <w:r>
+              <w:rPr>
+                <w:rFonts w:ascii="Calibri" w:hAnsi="Calibri" w:cs="Calibri"/>
+              </w:rPr>
+              <w:t>will reveal which exposures are implicated in shaping early child growth, providing basis for targeted intervention</w:t>
             </w:r>
           </w:p>
           <w:p>
@@ -546,30 +950,61 @@
               <w:pStyle w:val="ListParagraph"/>
               <w:numPr>
                 <w:ilvl w:val="0"/>
-                <w:numId w:val="5"/>
+                <w:numId w:val="20"/>
               </w:numPr>
-              <w:spacing w:line="276" w:lineRule="auto"/>
-              <w:rPr>
-                <w:rFonts w:ascii="Calibri" w:hAnsi="Calibri" w:cs="Calibri"/>
-              </w:rPr>
-            </w:pPr>
-            <w:r>
-              <w:rPr>
-                <w:rFonts w:ascii="Calibri" w:hAnsi="Calibri" w:cs="Calibri"/>
-              </w:rPr>
-              <w:t>Identifying heterogeneous growth trajectories and clustering these zBMI will allow for the detection of subsets of children that may respond differently to our exposures (i.e., maternal dietary, socioeconomic, clinical factors</w:t>
-            </w:r>
-            <w:r>
-              <w:rPr>
-                <w:rFonts w:ascii="Calibri" w:hAnsi="Calibri" w:cs="Calibri"/>
-              </w:rPr>
-              <w:t>, and gut microbiome</w:t>
-            </w:r>
-            <w:r>
-              <w:rPr>
-                <w:rFonts w:ascii="Calibri" w:hAnsi="Calibri" w:cs="Calibri"/>
-              </w:rPr>
-              <w:t>)</w:t>
+              <w:rPr>
+                <w:rFonts w:ascii="Calibri" w:hAnsi="Calibri" w:cs="Calibri"/>
+              </w:rPr>
+            </w:pPr>
+            <w:r>
+              <w:rPr>
+                <w:rFonts w:ascii="Calibri" w:hAnsi="Calibri" w:cs="Calibri"/>
+                <w:b/>
+                <w:bCs/>
+              </w:rPr>
+              <w:t>Identifying grow heterogeneity</w:t>
+            </w:r>
+            <w:r>
+              <w:rPr>
+                <w:rFonts w:ascii="Calibri" w:hAnsi="Calibri" w:cs="Calibri"/>
+              </w:rPr>
+              <w:t xml:space="preserve">: </w:t>
+            </w:r>
+            <w:r>
+              <w:rPr>
+                <w:rFonts w:ascii="Calibri" w:hAnsi="Calibri" w:cs="Calibri"/>
+              </w:rPr>
+              <w:t>By applying trajectory clustering to longitudinal zBMI data</w:t>
+            </w:r>
+            <w:r>
+              <w:rPr>
+                <w:rFonts w:ascii="Calibri" w:hAnsi="Calibri" w:cs="Calibri"/>
+              </w:rPr>
+              <w:t xml:space="preserve">, </w:t>
+            </w:r>
+            <w:r>
+              <w:rPr>
+                <w:rFonts w:ascii="Calibri" w:hAnsi="Calibri" w:cs="Calibri"/>
+              </w:rPr>
+              <w:t>standardized for age and sex according to WHO Child Growth Standards</w:t>
+            </w:r>
+            <w:r>
+              <w:rPr>
+                <w:rFonts w:ascii="Calibri" w:hAnsi="Calibri" w:cs="Calibri"/>
+              </w:rPr>
+              <w:t xml:space="preserve">, </w:t>
+            </w:r>
+            <w:r>
+              <w:rPr>
+                <w:rFonts w:ascii="Calibri" w:hAnsi="Calibri" w:cs="Calibri"/>
+              </w:rPr>
+              <w:t>we can identify subgroups of children with meaningful distinct growth patterns at 24 months</w:t>
+            </w:r>
+            <w:r>
+              <w:rPr>
+                <w:rFonts w:ascii="Calibri" w:hAnsi="Calibri" w:cs="Calibri"/>
+              </w:rPr>
+              <w:t xml:space="preserve"> of life. </w:t>
             </w:r>
           </w:p>
           <w:p>
@@ -577,18 +1012,153 @@
               <w:pStyle w:val="ListParagraph"/>
               <w:numPr>
                 <w:ilvl w:val="0"/>
-                <w:numId w:val="5"/>
+                <w:numId w:val="20"/>
               </w:numPr>
-              <w:spacing w:line="276" w:lineRule="auto"/>
-              <w:rPr>
-                <w:rFonts w:ascii="Calibri" w:hAnsi="Calibri" w:cs="Calibri"/>
-              </w:rPr>
-            </w:pPr>
-            <w:r>
-              <w:rPr>
-                <w:rFonts w:ascii="Calibri" w:hAnsi="Calibri" w:cs="Calibri"/>
-              </w:rPr>
-              <w:t>Inform precision nutrition strategies and targeted early-life interventions rather than generalized population-based recommendations</w:t>
+              <w:rPr>
+                <w:rFonts w:ascii="Calibri" w:hAnsi="Calibri" w:cs="Calibri"/>
+              </w:rPr>
+            </w:pPr>
+            <w:r>
+              <w:rPr>
+                <w:rFonts w:ascii="Calibri" w:hAnsi="Calibri" w:cs="Calibri"/>
+                <w:b/>
+                <w:bCs/>
+              </w:rPr>
+              <w:t>Identifying at-risk subgroups</w:t>
+            </w:r>
+            <w:r>
+              <w:rPr>
+                <w:rFonts w:ascii="Calibri" w:hAnsi="Calibri" w:cs="Calibri"/>
+              </w:rPr>
+              <w:t xml:space="preserve">: </w:t>
+            </w:r>
+            <w:r>
+              <w:rPr>
+                <w:rFonts w:ascii="Calibri" w:hAnsi="Calibri" w:cs="Calibri"/>
+              </w:rPr>
+              <w:t xml:space="preserve">Clustering zBMI trajectories will enable </w:t>
+            </w:r>
+            <w:r>
+              <w:rPr>
+                <w:rFonts w:ascii="Calibri" w:hAnsi="Calibri" w:cs="Calibri"/>
+              </w:rPr>
+              <w:t xml:space="preserve">the early </w:t>
+            </w:r>
+            <w:r>
+              <w:rPr>
+                <w:rFonts w:ascii="Calibri" w:hAnsi="Calibri" w:cs="Calibri"/>
+              </w:rPr>
+              <w:t>detection of children who may be on adverse growth paths early</w:t>
+            </w:r>
+            <w:r>
+              <w:rPr>
+                <w:rFonts w:ascii="Calibri" w:hAnsi="Calibri" w:cs="Calibri"/>
+              </w:rPr>
+              <w:t xml:space="preserve">, </w:t>
+            </w:r>
+            <w:r>
+              <w:rPr>
+                <w:rFonts w:ascii="Calibri" w:hAnsi="Calibri" w:cs="Calibri"/>
+              </w:rPr>
+              <w:t xml:space="preserve">aiding </w:t>
+            </w:r>
+            <w:r>
+              <w:rPr>
+                <w:rFonts w:ascii="Calibri" w:hAnsi="Calibri" w:cs="Calibri"/>
+              </w:rPr>
+              <w:t xml:space="preserve">timely </w:t>
+            </w:r>
+            <w:r>
+              <w:rPr>
+                <w:rFonts w:ascii="Calibri" w:hAnsi="Calibri" w:cs="Calibri"/>
+              </w:rPr>
+              <w:t xml:space="preserve">clinical and public health intervention. </w:t>
+            </w:r>
+          </w:p>
+          <w:p>
+            <w:pPr>
+              <w:pStyle w:val="ListParagraph"/>
+              <w:numPr>
+                <w:ilvl w:val="0"/>
+                <w:numId w:val="20"/>
+              </w:numPr>
+              <w:rPr>
+                <w:rFonts w:ascii="Calibri" w:hAnsi="Calibri" w:cs="Calibri"/>
+              </w:rPr>
+            </w:pPr>
+            <w:r>
+              <w:rPr>
+                <w:rFonts w:ascii="Calibri" w:hAnsi="Calibri" w:cs="Calibri"/>
+                <w:b/>
+                <w:bCs/>
+              </w:rPr>
+              <w:t>Informing precision nutrition strategies</w:t>
+            </w:r>
+            <w:r>
+              <w:rPr>
+                <w:rFonts w:ascii="Calibri" w:hAnsi="Calibri" w:cs="Calibri"/>
+              </w:rPr>
+              <w:t xml:space="preserve">: </w:t>
+            </w:r>
+            <w:r>
+              <w:rPr>
+                <w:rFonts w:ascii="Calibri" w:hAnsi="Calibri" w:cs="Calibri"/>
+              </w:rPr>
+              <w:t>F</w:t>
+            </w:r>
+            <w:r>
+              <w:rPr>
+                <w:rFonts w:ascii="Calibri" w:hAnsi="Calibri" w:cs="Calibri"/>
+              </w:rPr>
+              <w:t xml:space="preserve">indings from this project can support the </w:t>
+            </w:r>
+            <w:r>
+              <w:rPr>
+                <w:rFonts w:ascii="Calibri" w:hAnsi="Calibri" w:cs="Calibri"/>
+              </w:rPr>
+              <w:t>development of precision nutrition approaches</w:t>
+            </w:r>
+            <w:r>
+              <w:rPr>
+                <w:rFonts w:ascii="Calibri" w:hAnsi="Calibri" w:cs="Calibri"/>
+              </w:rPr>
+              <w:t xml:space="preserve"> tailor</w:t>
+            </w:r>
+            <w:r>
+              <w:rPr>
+                <w:rFonts w:ascii="Calibri" w:hAnsi="Calibri" w:cs="Calibri"/>
+              </w:rPr>
+              <w:t>ed</w:t>
+            </w:r>
+            <w:r>
+              <w:rPr>
+                <w:rFonts w:ascii="Calibri" w:hAnsi="Calibri" w:cs="Calibri"/>
+              </w:rPr>
+              <w:t xml:space="preserve"> to the specific </w:t>
+            </w:r>
+            <w:r>
+              <w:rPr>
+                <w:rFonts w:ascii="Calibri" w:hAnsi="Calibri" w:cs="Calibri"/>
+              </w:rPr>
+              <w:t xml:space="preserve">maternal </w:t>
+            </w:r>
+            <w:r>
+              <w:rPr>
+                <w:rFonts w:ascii="Calibri" w:hAnsi="Calibri" w:cs="Calibri"/>
+              </w:rPr>
+              <w:t xml:space="preserve">exposure profiles that are most </w:t>
+            </w:r>
+            <w:r>
+              <w:rPr>
+                <w:rFonts w:ascii="Calibri" w:hAnsi="Calibri" w:cs="Calibri"/>
+              </w:rPr>
+              <w:t>associated with</w:t>
+            </w:r>
+            <w:r>
+              <w:rPr>
+                <w:rFonts w:ascii="Calibri" w:hAnsi="Calibri" w:cs="Calibri"/>
+              </w:rPr>
+              <w:t xml:space="preserve"> high-risk growth trajectory clusters. </w:t>
             </w:r>
           </w:p>
         </w:tc>
@@ -644,19 +1214,71 @@
               <w:rPr>
                 <w:rFonts w:ascii="Calibri" w:hAnsi="Calibri" w:cs="Calibri"/>
               </w:rPr>
-              <w:t>Children will be clustered based on their zBMI scores at 24 months, and these clusters will be used to determine whether maternal dietary, socioeconomic, clinical factors</w:t>
-            </w:r>
-            <w:r>
-              <w:rPr>
-                <w:rFonts w:ascii="Calibri" w:hAnsi="Calibri" w:cs="Calibri"/>
-              </w:rPr>
-              <w:t>, and gut microbiome are associated</w:t>
-            </w:r>
-            <w:r>
-              <w:rPr>
-                <w:rFonts w:ascii="Calibri" w:hAnsi="Calibri" w:cs="Calibri"/>
-              </w:rPr>
-              <w:t xml:space="preserve"> with zBMI categories.</w:t>
+              <w:t xml:space="preserve">Children will be clustered based on their zBMI scores at 24 months, and these clusters will be used to determine whether maternal </w:t>
+            </w:r>
+            <w:r>
+              <w:rPr>
+                <w:rFonts w:ascii="Calibri" w:hAnsi="Calibri" w:cs="Calibri"/>
+              </w:rPr>
+              <w:t>UPF intake, total energy intake</w:t>
+            </w:r>
+            <w:r>
+              <w:rPr>
+                <w:rFonts w:ascii="Calibri" w:hAnsi="Calibri" w:cs="Calibri"/>
+              </w:rPr>
+              <w:t>,</w:t>
+            </w:r>
+            <w:r>
+              <w:rPr>
+                <w:rFonts w:ascii="Calibri" w:hAnsi="Calibri" w:cs="Calibri"/>
+              </w:rPr>
+              <w:t xml:space="preserve"> and</w:t>
+            </w:r>
+            <w:r>
+              <w:rPr>
+                <w:rFonts w:ascii="Calibri" w:hAnsi="Calibri" w:cs="Calibri"/>
+              </w:rPr>
+              <w:t xml:space="preserve"> </w:t>
+            </w:r>
+            <w:r>
+              <w:rPr>
+                <w:rFonts w:ascii="Calibri" w:hAnsi="Calibri" w:cs="Calibri"/>
+              </w:rPr>
+              <w:t>household income</w:t>
+            </w:r>
+            <w:r>
+              <w:rPr>
+                <w:rFonts w:ascii="Calibri" w:hAnsi="Calibri" w:cs="Calibri"/>
+              </w:rPr>
+              <w:t>, are associated with zBMI categories.</w:t>
+            </w:r>
+          </w:p>
+          <w:p>
+            <w:pPr>
+              <w:rPr>
+                <w:rFonts w:ascii="Calibri" w:hAnsi="Calibri" w:cs="Calibri"/>
+              </w:rPr>
+            </w:pPr>
+          </w:p>
+          <w:p>
+            <w:pPr>
+              <w:rPr>
+                <w:rFonts w:ascii="Calibri" w:hAnsi="Calibri" w:cs="Calibri"/>
+              </w:rPr>
+            </w:pPr>
+            <w:r>
+              <w:rPr>
+                <w:rFonts w:ascii="Calibri" w:hAnsi="Calibri" w:cs="Calibri"/>
+                <w:b/>
+                <w:bCs/>
+              </w:rPr>
+              <w:t>Outputs</w:t>
+            </w:r>
+            <w:r>
+              <w:rPr>
+                <w:rFonts w:ascii="Calibri" w:hAnsi="Calibri" w:cs="Calibri"/>
+              </w:rPr>
+              <w:t>:</w:t>
             </w:r>
           </w:p>
           <w:p>
@@ -673,8 +1295,76 @@
             <w:r>
               <w:rPr>
                 <w:rFonts w:ascii="Calibri" w:hAnsi="Calibri" w:cs="Calibri"/>
-              </w:rPr>
-              <w:t>A set of distinct child clusters, each characterized by some variables: Maternal dietary factors, Socioeconomic factors; Clinical biomarkers, and Gut Microbiome.</w:t>
+                <w:b/>
+                <w:bCs/>
+              </w:rPr>
+              <w:t>Distinct child growth clusters</w:t>
+            </w:r>
+            <w:r>
+              <w:rPr>
+                <w:rFonts w:ascii="Calibri" w:hAnsi="Calibri" w:cs="Calibri"/>
+              </w:rPr>
+              <w:t xml:space="preserve">: </w:t>
+            </w:r>
+            <w:r>
+              <w:rPr>
+                <w:rFonts w:ascii="Calibri" w:hAnsi="Calibri" w:cs="Calibri"/>
+              </w:rPr>
+              <w:t xml:space="preserve">A set of distinct child clusters, each characterized by </w:t>
+            </w:r>
+            <w:r>
+              <w:rPr>
+                <w:rFonts w:ascii="Calibri" w:hAnsi="Calibri" w:cs="Calibri"/>
+              </w:rPr>
+              <w:t>key</w:t>
+            </w:r>
+            <w:r>
+              <w:rPr>
+                <w:rFonts w:ascii="Calibri" w:hAnsi="Calibri" w:cs="Calibri"/>
+              </w:rPr>
+              <w:t xml:space="preserve"> variables: </w:t>
+            </w:r>
+            <w:r>
+              <w:rPr>
+                <w:rFonts w:ascii="Calibri" w:hAnsi="Calibri" w:cs="Calibri"/>
+              </w:rPr>
+              <w:t xml:space="preserve">maternal </w:t>
+            </w:r>
+            <w:r>
+              <w:rPr>
+                <w:rFonts w:ascii="Calibri" w:hAnsi="Calibri" w:cs="Calibri"/>
+              </w:rPr>
+              <w:t>UPF intake, total energy intake</w:t>
+            </w:r>
+            <w:r>
+              <w:rPr>
+                <w:rFonts w:ascii="Calibri" w:hAnsi="Calibri" w:cs="Calibri"/>
+              </w:rPr>
+              <w:t>,</w:t>
+            </w:r>
+            <w:r>
+              <w:rPr>
+                <w:rFonts w:ascii="Calibri" w:hAnsi="Calibri" w:cs="Calibri"/>
+              </w:rPr>
+              <w:t xml:space="preserve"> and</w:t>
+            </w:r>
+            <w:r>
+              <w:rPr>
+                <w:rFonts w:ascii="Calibri" w:hAnsi="Calibri" w:cs="Calibri"/>
+              </w:rPr>
+              <w:t xml:space="preserve"> </w:t>
+            </w:r>
+            <w:r>
+              <w:rPr>
+                <w:rFonts w:ascii="Calibri" w:hAnsi="Calibri" w:cs="Calibri"/>
+              </w:rPr>
+              <w:t>household income</w:t>
+            </w:r>
+            <w:r>
+              <w:rPr>
+                <w:rFonts w:ascii="Calibri" w:hAnsi="Calibri" w:cs="Calibri"/>
+              </w:rPr>
+              <w:t>.</w:t>
             </w:r>
           </w:p>
           <w:p>
@@ -691,9 +1381,58 @@
             <w:r>
               <w:rPr>
                 <w:rFonts w:ascii="Calibri" w:hAnsi="Calibri" w:cs="Calibri"/>
-              </w:rPr>
-              <w:lastRenderedPageBreak/>
-              <w:t>A visual summary (dendogram) that clearly shows cluster differences in zBMI and associated exposures.</w:t>
+                <w:b/>
+                <w:bCs/>
+              </w:rPr>
+              <w:t>A visual summary</w:t>
+            </w:r>
+            <w:r>
+              <w:rPr>
+                <w:rFonts w:ascii="Calibri" w:hAnsi="Calibri" w:cs="Calibri"/>
+              </w:rPr>
+              <w:t>:</w:t>
+            </w:r>
+            <w:r>
+              <w:rPr>
+                <w:rFonts w:ascii="Calibri" w:hAnsi="Calibri" w:cs="Calibri"/>
+              </w:rPr>
+              <w:t xml:space="preserve"> </w:t>
+            </w:r>
+            <w:r>
+              <w:rPr>
+                <w:rFonts w:ascii="Calibri" w:hAnsi="Calibri" w:cs="Calibri"/>
+              </w:rPr>
+              <w:t xml:space="preserve">A </w:t>
+            </w:r>
+            <w:r>
+              <w:rPr>
+                <w:rFonts w:ascii="Calibri" w:hAnsi="Calibri" w:cs="Calibri"/>
+              </w:rPr>
+              <w:t>dendrogram</w:t>
+            </w:r>
+            <w:r>
+              <w:rPr>
+                <w:rFonts w:ascii="Calibri" w:hAnsi="Calibri" w:cs="Calibri"/>
+              </w:rPr>
+              <w:t xml:space="preserve"> </w:t>
+            </w:r>
+            <w:r>
+              <w:rPr>
+                <w:rFonts w:ascii="Calibri" w:hAnsi="Calibri" w:cs="Calibri"/>
+              </w:rPr>
+              <w:t xml:space="preserve">that clearly shows cluster differences in zBMI and associated </w:t>
+            </w:r>
+            <w:r>
+              <w:rPr>
+                <w:rFonts w:ascii="Calibri" w:hAnsi="Calibri" w:cs="Calibri"/>
+              </w:rPr>
+              <w:t xml:space="preserve">maternal </w:t>
+            </w:r>
+            <w:r>
+              <w:rPr>
+                <w:rFonts w:ascii="Calibri" w:hAnsi="Calibri" w:cs="Calibri"/>
+              </w:rPr>
+              <w:t>exposures.</w:t>
             </w:r>
           </w:p>
           <w:p>
@@ -710,39 +1449,217 @@
             <w:r>
               <w:rPr>
                 <w:rFonts w:ascii="Calibri" w:hAnsi="Calibri" w:cs="Calibri"/>
-              </w:rPr>
-              <w:t>Interpretation for each cluster, e.g. Cluster A = high Ultra processed score + Low SCFA index + elevated CRP + low Shannon diversity.</w:t>
-            </w:r>
-          </w:p>
-          <w:p>
-            <w:pPr>
-              <w:rPr>
-                <w:rFonts w:ascii="Calibri" w:hAnsi="Calibri" w:cs="Calibri"/>
-              </w:rPr>
-            </w:pPr>
-            <w:r>
-              <w:rPr>
-                <w:rFonts w:ascii="Calibri" w:hAnsi="Calibri" w:cs="Calibri"/>
-              </w:rPr>
-              <w:t xml:space="preserve">Each cluster will be clinically interpreted, e.g. excess adiposity or moderate inflammation. </w:t>
-            </w:r>
-            <w:r>
-              <w:rPr>
-                <w:rFonts w:ascii="Calibri" w:hAnsi="Calibri" w:cs="Calibri"/>
-              </w:rPr>
-              <w:t>From these analyses, we may be able to extract useful information regarding which factors strongly associate and their directionality</w:t>
-            </w:r>
-            <w:r>
-              <w:rPr>
-                <w:rFonts w:ascii="Calibri" w:hAnsi="Calibri" w:cs="Calibri"/>
-              </w:rPr>
-              <w:t>, and to establish tailored intervention recommendations</w:t>
+                <w:b/>
+                <w:bCs/>
+              </w:rPr>
+              <w:t>Interpretation for each cluster</w:t>
+            </w:r>
+            <w:r>
+              <w:rPr>
+                <w:rFonts w:ascii="Calibri" w:hAnsi="Calibri" w:cs="Calibri"/>
+              </w:rPr>
+              <w:t xml:space="preserve">: </w:t>
+            </w:r>
+            <w:r>
+              <w:rPr>
+                <w:rFonts w:ascii="Calibri" w:hAnsi="Calibri" w:cs="Calibri"/>
+              </w:rPr>
+              <w:t>For example, a cluster</w:t>
+            </w:r>
+            <w:r>
+              <w:rPr>
+                <w:rFonts w:ascii="Calibri" w:hAnsi="Calibri" w:cs="Calibri"/>
+              </w:rPr>
+              <w:t xml:space="preserve"> </w:t>
+            </w:r>
+            <w:r>
+              <w:rPr>
+                <w:rFonts w:ascii="Calibri" w:hAnsi="Calibri" w:cs="Calibri"/>
+              </w:rPr>
+              <w:t xml:space="preserve">with </w:t>
+            </w:r>
+            <w:r>
+              <w:rPr>
+                <w:rFonts w:ascii="Calibri" w:hAnsi="Calibri" w:cs="Calibri"/>
+              </w:rPr>
+              <w:t>high</w:t>
+            </w:r>
+            <w:r>
+              <w:rPr>
+                <w:rFonts w:ascii="Calibri" w:hAnsi="Calibri" w:cs="Calibri"/>
+              </w:rPr>
+              <w:t xml:space="preserve"> </w:t>
+            </w:r>
+            <w:r>
+              <w:rPr>
+                <w:rFonts w:ascii="Calibri" w:hAnsi="Calibri" w:cs="Calibri"/>
+              </w:rPr>
+              <w:t xml:space="preserve">UPF </w:t>
+            </w:r>
+            <w:r>
+              <w:rPr>
+                <w:rFonts w:ascii="Calibri" w:hAnsi="Calibri" w:cs="Calibri"/>
+              </w:rPr>
+              <w:t>consumption</w:t>
+            </w:r>
+            <w:r>
+              <w:rPr>
+                <w:rFonts w:ascii="Calibri" w:hAnsi="Calibri" w:cs="Calibri"/>
+              </w:rPr>
+              <w:t xml:space="preserve"> + </w:t>
+            </w:r>
+            <w:r>
+              <w:rPr>
+                <w:rFonts w:ascii="Calibri" w:hAnsi="Calibri" w:cs="Calibri"/>
+              </w:rPr>
+              <w:t>high</w:t>
+            </w:r>
+            <w:r>
+              <w:rPr>
+                <w:rFonts w:ascii="Calibri" w:hAnsi="Calibri" w:cs="Calibri"/>
+              </w:rPr>
+              <w:t xml:space="preserve"> </w:t>
+            </w:r>
+            <w:r>
+              <w:rPr>
+                <w:rFonts w:ascii="Calibri" w:hAnsi="Calibri" w:cs="Calibri"/>
+              </w:rPr>
+              <w:t>total energy intake</w:t>
+            </w:r>
+            <w:r>
+              <w:rPr>
+                <w:rFonts w:ascii="Calibri" w:hAnsi="Calibri" w:cs="Calibri"/>
+              </w:rPr>
+              <w:t xml:space="preserve"> + </w:t>
+            </w:r>
+            <w:r>
+              <w:rPr>
+                <w:rFonts w:ascii="Calibri" w:hAnsi="Calibri" w:cs="Calibri"/>
+              </w:rPr>
+              <w:t>low</w:t>
+            </w:r>
+            <w:r>
+              <w:rPr>
+                <w:rFonts w:ascii="Calibri" w:hAnsi="Calibri" w:cs="Calibri"/>
+              </w:rPr>
+              <w:t xml:space="preserve"> </w:t>
+            </w:r>
+            <w:r>
+              <w:rPr>
+                <w:rFonts w:ascii="Calibri" w:hAnsi="Calibri" w:cs="Calibri"/>
+              </w:rPr>
+              <w:t>household income</w:t>
             </w:r>
             <w:r>
               <w:rPr>
                 <w:rFonts w:ascii="Calibri" w:hAnsi="Calibri" w:cs="Calibri"/>
               </w:rPr>
               <w:t>.</w:t>
+            </w:r>
+          </w:p>
+          <w:p>
+            <w:pPr>
+              <w:pStyle w:val="ListParagraph"/>
+              <w:rPr>
+                <w:rFonts w:ascii="Calibri" w:hAnsi="Calibri" w:cs="Calibri"/>
+              </w:rPr>
+            </w:pPr>
+          </w:p>
+          <w:p>
+            <w:pPr>
+              <w:rPr>
+                <w:rFonts w:ascii="Calibri" w:hAnsi="Calibri" w:cs="Calibri"/>
+              </w:rPr>
+            </w:pPr>
+            <w:r>
+              <w:rPr>
+                <w:rFonts w:ascii="Calibri" w:hAnsi="Calibri" w:cs="Calibri"/>
+              </w:rPr>
+              <w:t>Each cluster will be clinically interpreted</w:t>
+            </w:r>
+            <w:r>
+              <w:rPr>
+                <w:rFonts w:ascii="Calibri" w:hAnsi="Calibri" w:cs="Calibri"/>
+              </w:rPr>
+              <w:t>.</w:t>
+            </w:r>
+            <w:r>
+              <w:rPr>
+                <w:rFonts w:ascii="Calibri" w:hAnsi="Calibri" w:cs="Calibri"/>
+              </w:rPr>
+              <w:t xml:space="preserve"> From these analyses, we may be able to extract </w:t>
+            </w:r>
+            <w:r>
+              <w:rPr>
+                <w:rFonts w:ascii="Calibri" w:hAnsi="Calibri" w:cs="Calibri"/>
+              </w:rPr>
+              <w:t>meaningful</w:t>
+            </w:r>
+            <w:r>
+              <w:rPr>
+                <w:rFonts w:ascii="Calibri" w:hAnsi="Calibri" w:cs="Calibri"/>
+              </w:rPr>
+              <w:t xml:space="preserve"> information regarding which </w:t>
+            </w:r>
+            <w:r>
+              <w:rPr>
+                <w:rFonts w:ascii="Calibri" w:hAnsi="Calibri" w:cs="Calibri"/>
+              </w:rPr>
+              <w:t xml:space="preserve">maternal </w:t>
+            </w:r>
+            <w:r>
+              <w:rPr>
+                <w:rFonts w:ascii="Calibri" w:hAnsi="Calibri" w:cs="Calibri"/>
+              </w:rPr>
+              <w:t xml:space="preserve">factors </w:t>
+            </w:r>
+            <w:r>
+              <w:rPr>
+                <w:rFonts w:ascii="Calibri" w:hAnsi="Calibri" w:cs="Calibri"/>
+              </w:rPr>
+              <w:t xml:space="preserve">are </w:t>
+            </w:r>
+            <w:r>
+              <w:rPr>
+                <w:rFonts w:ascii="Calibri" w:hAnsi="Calibri" w:cs="Calibri"/>
+              </w:rPr>
+              <w:t>strongly associate</w:t>
+            </w:r>
+            <w:r>
+              <w:rPr>
+                <w:rFonts w:ascii="Calibri" w:hAnsi="Calibri" w:cs="Calibri"/>
+              </w:rPr>
+              <w:t>d with adverse growth trajectories</w:t>
+            </w:r>
+            <w:r>
+              <w:rPr>
+                <w:rFonts w:ascii="Calibri" w:hAnsi="Calibri" w:cs="Calibri"/>
+              </w:rPr>
+              <w:t xml:space="preserve"> and </w:t>
+            </w:r>
+            <w:r>
+              <w:rPr>
+                <w:rFonts w:ascii="Calibri" w:hAnsi="Calibri" w:cs="Calibri"/>
+              </w:rPr>
+              <w:t>the directionality</w:t>
+            </w:r>
+            <w:r>
+              <w:rPr>
+                <w:rFonts w:ascii="Calibri" w:hAnsi="Calibri" w:cs="Calibri"/>
+              </w:rPr>
+              <w:t xml:space="preserve"> of those associations.</w:t>
+            </w:r>
+            <w:r>
+              <w:rPr>
+                <w:rFonts w:ascii="Calibri" w:hAnsi="Calibri" w:cs="Calibri"/>
+              </w:rPr>
+              <w:t xml:space="preserve"> </w:t>
+            </w:r>
+            <w:r>
+              <w:rPr>
+                <w:rFonts w:ascii="Calibri" w:hAnsi="Calibri" w:cs="Calibri"/>
+              </w:rPr>
+              <w:t xml:space="preserve">We may then use this evidence to establish tailored, early-life interventions. </w:t>
             </w:r>
           </w:p>
         </w:tc>
@@ -1003,6 +1920,7 @@
               <w:rPr>
                 <w:rFonts w:ascii="Calibri" w:hAnsi="Calibri" w:cs="Calibri"/>
               </w:rPr>
+              <w:lastRenderedPageBreak/>
               <w:t xml:space="preserve">Protein </w:t>
             </w:r>
             <w:r>
@@ -1107,7 +2025,13 @@
               <w:rPr>
                 <w:rFonts w:ascii="Calibri" w:hAnsi="Calibri" w:cs="Calibri"/>
               </w:rPr>
-              <w:t>acteriodetes ratio</w:t>
+              <w:t>acteroidetes</w:t>
+            </w:r>
+            <w:r>
+              <w:rPr>
+                <w:rFonts w:ascii="Calibri" w:hAnsi="Calibri" w:cs="Calibri"/>
+              </w:rPr>
+              <w:t xml:space="preserve"> ratio</w:t>
             </w:r>
             <w:r>
               <w:rPr>
@@ -1512,7 +2436,6 @@
               <w:rPr>
                 <w:rFonts w:ascii="Calibri" w:hAnsi="Calibri" w:cs="Calibri"/>
               </w:rPr>
-              <w:lastRenderedPageBreak/>
               <w:t xml:space="preserve">BMI &amp; </w:t>
             </w:r>
             <w:r>
@@ -2072,13 +2995,13 @@
               <w:rPr>
                 <w:rFonts w:ascii="Calibri" w:hAnsi="Calibri" w:cs="Calibri"/>
               </w:rPr>
-              <w:t>SCFA</w:t>
-            </w:r>
-            <w:r>
-              <w:rPr>
-                <w:rFonts w:ascii="Calibri" w:hAnsi="Calibri" w:cs="Calibri"/>
-              </w:rPr>
-              <w:t xml:space="preserve"> index</w:t>
+              <w:t xml:space="preserve">Ultra-processed </w:t>
+            </w:r>
+            <w:r>
+              <w:rPr>
+                <w:rFonts w:ascii="Calibri" w:hAnsi="Calibri" w:cs="Calibri"/>
+              </w:rPr>
+              <w:t>score</w:t>
             </w:r>
           </w:p>
           <w:p>
@@ -2102,100 +3025,6 @@
           </w:p>
           <w:p>
             <w:pPr>
-              <w:pStyle w:val="ListParagraph"/>
-              <w:numPr>
-                <w:ilvl w:val="0"/>
-                <w:numId w:val="6"/>
-              </w:numPr>
-              <w:spacing w:line="276" w:lineRule="auto"/>
-              <w:rPr>
-                <w:rFonts w:ascii="Calibri" w:hAnsi="Calibri" w:cs="Calibri"/>
-              </w:rPr>
-            </w:pPr>
-            <w:r>
-              <w:rPr>
-                <w:rFonts w:ascii="Calibri" w:hAnsi="Calibri" w:cs="Calibri"/>
-              </w:rPr>
-              <w:t>Fiber</w:t>
-            </w:r>
-            <w:r>
-              <w:rPr>
-                <w:rFonts w:ascii="Calibri" w:hAnsi="Calibri" w:cs="Calibri"/>
-              </w:rPr>
-              <w:t xml:space="preserve"> intake (g)</w:t>
-            </w:r>
-          </w:p>
-          <w:p>
-            <w:pPr>
-              <w:pStyle w:val="ListParagraph"/>
-              <w:numPr>
-                <w:ilvl w:val="0"/>
-                <w:numId w:val="6"/>
-              </w:numPr>
-              <w:spacing w:line="276" w:lineRule="auto"/>
-              <w:rPr>
-                <w:rFonts w:ascii="Calibri" w:hAnsi="Calibri" w:cs="Calibri"/>
-              </w:rPr>
-            </w:pPr>
-            <w:r>
-              <w:rPr>
-                <w:rFonts w:ascii="Calibri" w:hAnsi="Calibri" w:cs="Calibri"/>
-              </w:rPr>
-              <w:t xml:space="preserve">Protein </w:t>
-            </w:r>
-            <w:r>
-              <w:rPr>
-                <w:rFonts w:ascii="Calibri" w:hAnsi="Calibri" w:cs="Calibri"/>
-              </w:rPr>
-              <w:t>intake (g)</w:t>
-            </w:r>
-          </w:p>
-          <w:p>
-            <w:pPr>
-              <w:pStyle w:val="ListParagraph"/>
-              <w:numPr>
-                <w:ilvl w:val="0"/>
-                <w:numId w:val="6"/>
-              </w:numPr>
-              <w:spacing w:line="276" w:lineRule="auto"/>
-              <w:rPr>
-                <w:rFonts w:ascii="Calibri" w:hAnsi="Calibri" w:cs="Calibri"/>
-              </w:rPr>
-            </w:pPr>
-            <w:r>
-              <w:rPr>
-                <w:rFonts w:ascii="Calibri" w:hAnsi="Calibri" w:cs="Calibri"/>
-              </w:rPr>
-              <w:t xml:space="preserve">Ultra-processed </w:t>
-            </w:r>
-            <w:r>
-              <w:rPr>
-                <w:rFonts w:ascii="Calibri" w:hAnsi="Calibri" w:cs="Calibri"/>
-              </w:rPr>
-              <w:t>score</w:t>
-            </w:r>
-          </w:p>
-          <w:p>
-            <w:pPr>
-              <w:pStyle w:val="ListParagraph"/>
-              <w:numPr>
-                <w:ilvl w:val="0"/>
-                <w:numId w:val="6"/>
-              </w:numPr>
-              <w:spacing w:line="276" w:lineRule="auto"/>
-              <w:rPr>
-                <w:rFonts w:ascii="Calibri" w:hAnsi="Calibri" w:cs="Calibri"/>
-              </w:rPr>
-            </w:pPr>
-            <w:r>
-              <w:rPr>
-                <w:rFonts w:ascii="Calibri" w:hAnsi="Calibri" w:cs="Calibri"/>
-              </w:rPr>
-              <w:t>Dietary pattern score</w:t>
-            </w:r>
-          </w:p>
-          <w:p>
-            <w:pPr>
               <w:rPr>
                 <w:rFonts w:ascii="Calibri" w:hAnsi="Calibri" w:cs="Calibri"/>
               </w:rPr>
@@ -2238,114 +3067,6 @@
           </w:p>
           <w:p>
             <w:pPr>
-              <w:pStyle w:val="ListParagraph"/>
-              <w:numPr>
-                <w:ilvl w:val="0"/>
-                <w:numId w:val="7"/>
-              </w:numPr>
-              <w:spacing w:line="276" w:lineRule="auto"/>
-              <w:rPr>
-                <w:rFonts w:ascii="Calibri" w:hAnsi="Calibri" w:cs="Calibri"/>
-              </w:rPr>
-            </w:pPr>
-            <w:r>
-              <w:rPr>
-                <w:rFonts w:ascii="Calibri" w:hAnsi="Calibri" w:cs="Calibri"/>
-              </w:rPr>
-              <w:t>Maternal education</w:t>
-            </w:r>
-            <w:r>
-              <w:rPr>
-                <w:rFonts w:ascii="Calibri" w:hAnsi="Calibri" w:cs="Calibri"/>
-              </w:rPr>
-              <w:t xml:space="preserve"> (years)</w:t>
-            </w:r>
-          </w:p>
-          <w:p>
-            <w:pPr>
-              <w:rPr>
-                <w:rFonts w:ascii="Calibri" w:hAnsi="Calibri" w:cs="Calibri"/>
-              </w:rPr>
-            </w:pPr>
-            <w:r>
-              <w:rPr>
-                <w:rFonts w:ascii="Calibri" w:hAnsi="Calibri" w:cs="Calibri"/>
-                <w:b/>
-                <w:bCs/>
-              </w:rPr>
-              <w:t>Clinical biomarkers:</w:t>
-            </w:r>
-            <w:r>
-              <w:rPr>
-                <w:rFonts w:ascii="Calibri" w:hAnsi="Calibri" w:cs="Calibri"/>
-                <w:b/>
-                <w:bCs/>
-              </w:rPr>
-              <w:t xml:space="preserve"> </w:t>
-            </w:r>
-          </w:p>
-          <w:p>
-            <w:pPr>
-              <w:pStyle w:val="ListParagraph"/>
-              <w:numPr>
-                <w:ilvl w:val="0"/>
-                <w:numId w:val="8"/>
-              </w:numPr>
-              <w:spacing w:line="276" w:lineRule="auto"/>
-              <w:rPr>
-                <w:rFonts w:ascii="Calibri" w:hAnsi="Calibri" w:cs="Calibri"/>
-              </w:rPr>
-            </w:pPr>
-            <w:r>
-              <w:rPr>
-                <w:rFonts w:ascii="Calibri" w:hAnsi="Calibri" w:cs="Calibri"/>
-              </w:rPr>
-              <w:t xml:space="preserve">Fasting glucose </w:t>
-            </w:r>
-          </w:p>
-          <w:p>
-            <w:pPr>
-              <w:pStyle w:val="ListParagraph"/>
-              <w:numPr>
-                <w:ilvl w:val="0"/>
-                <w:numId w:val="8"/>
-              </w:numPr>
-              <w:spacing w:line="276" w:lineRule="auto"/>
-              <w:rPr>
-                <w:rFonts w:ascii="Calibri" w:hAnsi="Calibri" w:cs="Calibri"/>
-              </w:rPr>
-            </w:pPr>
-            <w:r>
-              <w:rPr>
-                <w:rFonts w:ascii="Calibri" w:hAnsi="Calibri" w:cs="Calibri"/>
-              </w:rPr>
-              <w:t>C-reactive protein (CRP)</w:t>
-            </w:r>
-          </w:p>
-          <w:p>
-            <w:pPr>
-              <w:pStyle w:val="ListParagraph"/>
-              <w:numPr>
-                <w:ilvl w:val="0"/>
-                <w:numId w:val="8"/>
-              </w:numPr>
-              <w:spacing w:line="276" w:lineRule="auto"/>
-              <w:rPr>
-                <w:rFonts w:ascii="Calibri" w:hAnsi="Calibri" w:cs="Calibri"/>
-                <w:b/>
-                <w:bCs/>
-              </w:rPr>
-            </w:pPr>
-            <w:r>
-              <w:rPr>
-                <w:rFonts w:ascii="Calibri" w:hAnsi="Calibri" w:cs="Calibri"/>
-              </w:rPr>
-              <w:lastRenderedPageBreak/>
-              <w:t>Alanine aminotransferase (ALT)</w:t>
-            </w:r>
-          </w:p>
-          <w:p>
-            <w:pPr>
               <w:rPr>
                 <w:rFonts w:ascii="Calibri" w:hAnsi="Calibri" w:cs="Calibri"/>
                 <w:b/>
@@ -2359,81 +3080,6 @@
                 <w:bCs/>
               </w:rPr>
               <w:t>Child growth variables:</w:t>
-            </w:r>
-          </w:p>
-          <w:p>
-            <w:pPr>
-              <w:pStyle w:val="ListParagraph"/>
-              <w:numPr>
-                <w:ilvl w:val="0"/>
-                <w:numId w:val="9"/>
-              </w:numPr>
-              <w:spacing w:line="276" w:lineRule="auto"/>
-              <w:rPr>
-                <w:rFonts w:ascii="Calibri" w:hAnsi="Calibri" w:cs="Calibri"/>
-              </w:rPr>
-            </w:pPr>
-            <w:r>
-              <w:rPr>
-                <w:rFonts w:ascii="Calibri" w:hAnsi="Calibri" w:cs="Calibri"/>
-              </w:rPr>
-              <w:t>Age</w:t>
-            </w:r>
-            <w:r>
-              <w:rPr>
-                <w:rFonts w:ascii="Calibri" w:hAnsi="Calibri" w:cs="Calibri"/>
-              </w:rPr>
-              <w:t xml:space="preserve"> at 24 months</w:t>
-            </w:r>
-          </w:p>
-          <w:p>
-            <w:pPr>
-              <w:pStyle w:val="ListParagraph"/>
-              <w:numPr>
-                <w:ilvl w:val="0"/>
-                <w:numId w:val="9"/>
-              </w:numPr>
-              <w:spacing w:line="276" w:lineRule="auto"/>
-              <w:rPr>
-                <w:rFonts w:ascii="Calibri" w:hAnsi="Calibri" w:cs="Calibri"/>
-              </w:rPr>
-            </w:pPr>
-            <w:r>
-              <w:rPr>
-                <w:rFonts w:ascii="Calibri" w:hAnsi="Calibri" w:cs="Calibri"/>
-              </w:rPr>
-              <w:t xml:space="preserve">Weight </w:t>
-            </w:r>
-            <w:r>
-              <w:rPr>
-                <w:rFonts w:ascii="Calibri" w:hAnsi="Calibri" w:cs="Calibri"/>
-              </w:rPr>
-              <w:t>at 6, 12, and 24 months</w:t>
-            </w:r>
-          </w:p>
-          <w:p>
-            <w:pPr>
-              <w:pStyle w:val="ListParagraph"/>
-              <w:numPr>
-                <w:ilvl w:val="0"/>
-                <w:numId w:val="9"/>
-              </w:numPr>
-              <w:spacing w:line="276" w:lineRule="auto"/>
-              <w:rPr>
-                <w:rFonts w:ascii="Calibri" w:hAnsi="Calibri" w:cs="Calibri"/>
-              </w:rPr>
-            </w:pPr>
-            <w:r>
-              <w:rPr>
-                <w:rFonts w:ascii="Calibri" w:hAnsi="Calibri" w:cs="Calibri"/>
-              </w:rPr>
-              <w:t>Length at 6, 12, and 24 months</w:t>
-            </w:r>
-            <w:r>
-              <w:rPr>
-                <w:rFonts w:ascii="Calibri" w:hAnsi="Calibri" w:cs="Calibri"/>
-              </w:rPr>
-              <w:t xml:space="preserve"> </w:t>
             </w:r>
           </w:p>
           <w:p>
@@ -2858,6 +3504,7 @@
                 <w:rFonts w:ascii="Calibri" w:hAnsi="Calibri" w:cs="Calibri"/>
                 <w:lang w:val="en-CA"/>
               </w:rPr>
+              <w:lastRenderedPageBreak/>
               <w:t>Treat impossible CRP values (negative) and will be recode as missing and applied for imputation or exclude.</w:t>
             </w:r>
           </w:p>
@@ -2913,14 +3560,7 @@
               <w:rPr>
                 <w:rFonts w:ascii="Calibri" w:hAnsi="Calibri" w:cs="Calibri"/>
               </w:rPr>
-              <w:t xml:space="preserve">Any missing values will be assessed to determine if it is more appropriate to remove the entire record (deletion) or replace missing values using estimates (imputation) either by using mean/median imputation (replacing the missing values with the mean of the column), mode imputation </w:t>
-            </w:r>
-            <w:r>
-              <w:rPr>
-                <w:rFonts w:ascii="Calibri" w:hAnsi="Calibri" w:cs="Calibri"/>
-              </w:rPr>
-              <w:lastRenderedPageBreak/>
-              <w:t xml:space="preserve">(replacing the missing value with the most common, i.e., mode, value of the column) or using </w:t>
+              <w:t xml:space="preserve">Any missing values will be assessed to determine if it is more appropriate to remove the entire record (deletion) or replace missing values using estimates (imputation) either by using mean/median imputation (replacing the missing values with the mean of the column), mode imputation (replacing the missing value with the most common, i.e., mode, value of the column) or using </w:t>
             </w:r>
             <w:r>
               <w:rPr>
@@ -3078,19 +3718,31 @@
               <w:rPr>
                 <w:rFonts w:ascii="Calibri" w:eastAsia="Calibri" w:hAnsi="Calibri" w:cs="Calibri"/>
               </w:rPr>
-              <w:t>patterns across timepoints (</w:t>
+              <w:t xml:space="preserve">patterns </w:t>
             </w:r>
             <w:r>
               <w:rPr>
                 <w:rFonts w:ascii="Calibri" w:eastAsia="Calibri" w:hAnsi="Calibri" w:cs="Calibri"/>
               </w:rPr>
-              <w:t xml:space="preserve">0, </w:t>
+              <w:t>at</w:t>
             </w:r>
             <w:r>
               <w:rPr>
                 <w:rFonts w:ascii="Calibri" w:eastAsia="Calibri" w:hAnsi="Calibri" w:cs="Calibri"/>
               </w:rPr>
-              <w:t>6, 12, and 24 months).</w:t>
+              <w:t xml:space="preserve"> timepoint</w:t>
+            </w:r>
+            <w:r>
+              <w:rPr>
+                <w:rFonts w:ascii="Calibri" w:eastAsia="Calibri" w:hAnsi="Calibri" w:cs="Calibri"/>
+              </w:rPr>
+              <w:t xml:space="preserve"> </w:t>
+            </w:r>
+            <w:r>
+              <w:rPr>
+                <w:rFonts w:ascii="Calibri" w:eastAsia="Calibri" w:hAnsi="Calibri" w:cs="Calibri"/>
+              </w:rPr>
+              <w:t>24 months.</w:t>
             </w:r>
             <w:r>
               <w:rPr>
@@ -3445,6 +4097,7 @@
               <w:rPr>
                 <w:rFonts w:ascii="Calibri" w:eastAsia="Calibri" w:hAnsi="Calibri" w:cs="Calibri"/>
               </w:rPr>
+              <w:lastRenderedPageBreak/>
               <w:t>Within-cluster variance</w:t>
             </w:r>
           </w:p>
@@ -3633,7 +4286,6 @@
               <w:rPr>
                 <w:rFonts w:ascii="Calibri" w:eastAsia="Calibri" w:hAnsi="Calibri" w:cs="Calibri"/>
               </w:rPr>
-              <w:lastRenderedPageBreak/>
               <w:t xml:space="preserve">Precision nutrition insights from integrating multiple data domains (diet, gut microbiome, clinical, and socioeconomic) rather than single variables alone. </w:t>
             </w:r>
           </w:p>
@@ -3675,7 +4327,6 @@
                 <w:b/>
                 <w:bCs/>
               </w:rPr>
-              <w:lastRenderedPageBreak/>
               <w:t>6</w:t>
             </w:r>
           </w:p>
@@ -4214,40 +4865,593 @@
     </w:p>
     <w:p>
       <w:pPr>
+        <w:pStyle w:val="ListParagraph"/>
+        <w:numPr>
+          <w:ilvl w:val="0"/>
+          <w:numId w:val="19"/>
+        </w:numPr>
+        <w:ind w:left="567" w:hanging="567"/>
         <w:rPr>
           <w:rFonts w:ascii="Calibri" w:hAnsi="Calibri" w:cs="Calibri"/>
           <w:b/>
           <w:bCs/>
         </w:rPr>
       </w:pPr>
-    </w:p>
-    <w:p>
-      <w:pPr>
+      <w:r>
         <w:rPr>
           <w:rFonts w:ascii="Calibri" w:hAnsi="Calibri" w:cs="Calibri"/>
           <w:b/>
           <w:bCs/>
-        </w:rPr>
-      </w:pPr>
+          <w:lang w:val="en-ID"/>
+        </w:rPr>
+        <w:t>Pipeline Flow</w:t>
+      </w:r>
     </w:p>
     <w:p>
       <w:pPr>
+        <w:pStyle w:val="ListParagraph"/>
+        <w:numPr>
+          <w:ilvl w:val="0"/>
+          <w:numId w:val="22"/>
+        </w:numPr>
         <w:rPr>
           <w:rFonts w:ascii="Calibri" w:hAnsi="Calibri" w:cs="Calibri"/>
           <w:b/>
           <w:bCs/>
         </w:rPr>
       </w:pPr>
-    </w:p>
-    <w:p>
-      <w:pPr>
+      <w:r>
         <w:rPr>
           <w:rFonts w:ascii="Calibri" w:hAnsi="Calibri" w:cs="Calibri"/>
           <w:b/>
           <w:bCs/>
         </w:rPr>
-      </w:pPr>
+        <w:t>Preprocessing</w:t>
+      </w:r>
+      <w:r>
+        <w:rPr>
+          <w:rFonts w:ascii="Calibri" w:hAnsi="Calibri" w:cs="Calibri"/>
+          <w:b/>
+          <w:bCs/>
+        </w:rPr>
+        <w:t xml:space="preserve"> Data</w:t>
+      </w:r>
     </w:p>
+    <w:p>
+      <w:pPr>
+        <w:pStyle w:val="ListParagraph"/>
+        <w:numPr>
+          <w:ilvl w:val="0"/>
+          <w:numId w:val="21"/>
+        </w:numPr>
+        <w:rPr>
+          <w:rFonts w:ascii="Calibri" w:hAnsi="Calibri" w:cs="Calibri"/>
+        </w:rPr>
+      </w:pPr>
+      <w:r>
+        <w:rPr>
+          <w:rFonts w:ascii="Calibri" w:hAnsi="Calibri" w:cs="Calibri"/>
+        </w:rPr>
+        <w:t>For all variables:</w:t>
+      </w:r>
+    </w:p>
+    <w:p>
+      <w:pPr>
+        <w:pStyle w:val="ListParagraph"/>
+        <w:numPr>
+          <w:ilvl w:val="1"/>
+          <w:numId w:val="21"/>
+        </w:numPr>
+        <w:rPr>
+          <w:rFonts w:ascii="Calibri" w:hAnsi="Calibri" w:cs="Calibri"/>
+        </w:rPr>
+      </w:pPr>
+      <w:r>
+        <w:rPr>
+          <w:rFonts w:ascii="Calibri" w:hAnsi="Calibri" w:cs="Calibri"/>
+        </w:rPr>
+        <w:t>Explore</w:t>
+      </w:r>
+      <w:r>
+        <w:rPr>
+          <w:rFonts w:ascii="Calibri" w:hAnsi="Calibri" w:cs="Calibri"/>
+        </w:rPr>
+        <w:t xml:space="preserve"> missing data</w:t>
+      </w:r>
+      <w:r>
+        <w:rPr>
+          <w:rFonts w:ascii="Calibri" w:hAnsi="Calibri" w:cs="Calibri"/>
+        </w:rPr>
+        <w:t xml:space="preserve"> from all 30 available variables</w:t>
+      </w:r>
+      <w:r>
+        <w:rPr>
+          <w:rFonts w:ascii="Calibri" w:hAnsi="Calibri" w:cs="Calibri"/>
+        </w:rPr>
+        <w:t xml:space="preserve"> and</w:t>
+      </w:r>
+      <w:r>
+        <w:rPr>
+          <w:rFonts w:ascii="Calibri" w:hAnsi="Calibri" w:cs="Calibri"/>
+        </w:rPr>
+        <w:t xml:space="preserve"> identify</w:t>
+      </w:r>
+      <w:r>
+        <w:rPr>
+          <w:rFonts w:ascii="Calibri" w:hAnsi="Calibri" w:cs="Calibri"/>
+        </w:rPr>
+        <w:t xml:space="preserve"> their pattern</w:t>
+      </w:r>
+      <w:r>
+        <w:rPr>
+          <w:rFonts w:ascii="Calibri" w:hAnsi="Calibri" w:cs="Calibri"/>
+        </w:rPr>
+        <w:t>s</w:t>
+      </w:r>
+    </w:p>
+    <w:p>
+      <w:pPr>
+        <w:pStyle w:val="ListParagraph"/>
+        <w:numPr>
+          <w:ilvl w:val="1"/>
+          <w:numId w:val="21"/>
+        </w:numPr>
+        <w:rPr>
+          <w:rFonts w:ascii="Calibri" w:hAnsi="Calibri" w:cs="Calibri"/>
+        </w:rPr>
+      </w:pPr>
+      <w:r>
+        <w:rPr>
+          <w:rFonts w:ascii="Calibri" w:hAnsi="Calibri" w:cs="Calibri"/>
+        </w:rPr>
+        <w:t>Inspect data distribution</w:t>
+      </w:r>
+    </w:p>
+    <w:p>
+      <w:pPr>
+        <w:pStyle w:val="ListParagraph"/>
+        <w:numPr>
+          <w:ilvl w:val="1"/>
+          <w:numId w:val="21"/>
+        </w:numPr>
+        <w:rPr>
+          <w:rFonts w:ascii="Calibri" w:hAnsi="Calibri" w:cs="Calibri"/>
+        </w:rPr>
+      </w:pPr>
+      <w:r>
+        <w:rPr>
+          <w:rFonts w:ascii="Calibri" w:hAnsi="Calibri" w:cs="Calibri"/>
+        </w:rPr>
+        <w:t>Remove implausible values from variables</w:t>
+      </w:r>
+      <w:r>
+        <w:rPr>
+          <w:rFonts w:ascii="Calibri" w:hAnsi="Calibri" w:cs="Calibri"/>
+        </w:rPr>
+        <w:t xml:space="preserve"> </w:t>
+      </w:r>
+    </w:p>
+    <w:p>
+      <w:pPr>
+        <w:pStyle w:val="ListParagraph"/>
+        <w:numPr>
+          <w:ilvl w:val="1"/>
+          <w:numId w:val="21"/>
+        </w:numPr>
+        <w:rPr>
+          <w:rFonts w:ascii="Calibri" w:hAnsi="Calibri" w:cs="Calibri"/>
+        </w:rPr>
+      </w:pPr>
+      <w:r>
+        <w:rPr>
+          <w:rFonts w:ascii="Calibri" w:hAnsi="Calibri" w:cs="Calibri"/>
+        </w:rPr>
+        <w:t>Save cleaned dataset</w:t>
+      </w:r>
+    </w:p>
+    <w:p>
+      <w:pPr>
+        <w:pStyle w:val="ListParagraph"/>
+        <w:numPr>
+          <w:ilvl w:val="0"/>
+          <w:numId w:val="21"/>
+        </w:numPr>
+        <w:rPr>
+          <w:rFonts w:ascii="Calibri" w:hAnsi="Calibri" w:cs="Calibri"/>
+        </w:rPr>
+      </w:pPr>
+      <w:r>
+        <w:rPr>
+          <w:rFonts w:ascii="Calibri" w:hAnsi="Calibri" w:cs="Calibri"/>
+        </w:rPr>
+        <w:t>Variables used for downstream analyses</w:t>
+      </w:r>
+      <w:r>
+        <w:rPr>
+          <w:rFonts w:ascii="Calibri" w:hAnsi="Calibri" w:cs="Calibri"/>
+        </w:rPr>
+        <w:t>:</w:t>
+      </w:r>
+    </w:p>
+    <w:p>
+      <w:pPr>
+        <w:pStyle w:val="ListParagraph"/>
+        <w:numPr>
+          <w:ilvl w:val="1"/>
+          <w:numId w:val="21"/>
+        </w:numPr>
+        <w:rPr>
+          <w:rFonts w:ascii="Calibri" w:hAnsi="Calibri" w:cs="Calibri"/>
+        </w:rPr>
+      </w:pPr>
+      <w:r>
+        <w:rPr>
+          <w:rFonts w:ascii="Calibri" w:hAnsi="Calibri" w:cs="Calibri"/>
+        </w:rPr>
+        <w:t>zBMI_24m</w:t>
+      </w:r>
+    </w:p>
+    <w:p>
+      <w:pPr>
+        <w:pStyle w:val="ListParagraph"/>
+        <w:numPr>
+          <w:ilvl w:val="1"/>
+          <w:numId w:val="21"/>
+        </w:numPr>
+        <w:rPr>
+          <w:rFonts w:ascii="Calibri" w:hAnsi="Calibri" w:cs="Calibri"/>
+        </w:rPr>
+      </w:pPr>
+      <w:r>
+        <w:rPr>
+          <w:rFonts w:ascii="Calibri" w:hAnsi="Calibri" w:cs="Calibri"/>
+        </w:rPr>
+        <w:t>Household_income_index</w:t>
+      </w:r>
+    </w:p>
+    <w:p>
+      <w:pPr>
+        <w:pStyle w:val="ListParagraph"/>
+        <w:numPr>
+          <w:ilvl w:val="1"/>
+          <w:numId w:val="21"/>
+        </w:numPr>
+        <w:rPr>
+          <w:rFonts w:ascii="Calibri" w:hAnsi="Calibri" w:cs="Calibri"/>
+        </w:rPr>
+      </w:pPr>
+      <w:r>
+        <w:rPr>
+          <w:rFonts w:ascii="Calibri" w:hAnsi="Calibri" w:cs="Calibri"/>
+        </w:rPr>
+        <w:t>Ultra_processed_score</w:t>
+      </w:r>
+    </w:p>
+    <w:p>
+      <w:pPr>
+        <w:pStyle w:val="ListParagraph"/>
+        <w:numPr>
+          <w:ilvl w:val="1"/>
+          <w:numId w:val="21"/>
+        </w:numPr>
+        <w:rPr>
+          <w:rFonts w:ascii="Calibri" w:hAnsi="Calibri" w:cs="Calibri"/>
+        </w:rPr>
+      </w:pPr>
+      <w:r>
+        <w:rPr>
+          <w:rFonts w:ascii="Calibri" w:hAnsi="Calibri" w:cs="Calibri"/>
+        </w:rPr>
+        <w:t>Energy_intake_kcal</w:t>
+      </w:r>
+    </w:p>
+    <w:p>
+      <w:pPr>
+        <w:pStyle w:val="ListParagraph"/>
+        <w:numPr>
+          <w:ilvl w:val="0"/>
+          <w:numId w:val="22"/>
+        </w:numPr>
+        <w:rPr>
+          <w:rFonts w:ascii="Calibri" w:hAnsi="Calibri" w:cs="Calibri"/>
+          <w:b/>
+          <w:bCs/>
+        </w:rPr>
+      </w:pPr>
+      <w:r>
+        <w:rPr>
+          <w:b/>
+          <w:bCs/>
+        </w:rPr>
+        <w:t>Cluster Growth Trajectories</w:t>
+      </w:r>
+    </w:p>
+    <w:p>
+      <w:pPr>
+        <w:pStyle w:val="ListParagraph"/>
+        <w:numPr>
+          <w:ilvl w:val="0"/>
+          <w:numId w:val="21"/>
+        </w:numPr>
+        <w:rPr>
+          <w:rFonts w:ascii="Calibri" w:hAnsi="Calibri" w:cs="Calibri"/>
+        </w:rPr>
+      </w:pPr>
+      <w:r>
+        <w:rPr>
+          <w:rFonts w:ascii="Calibri" w:hAnsi="Calibri" w:cs="Calibri"/>
+        </w:rPr>
+        <w:t>Cluster Tendency Assessment</w:t>
+      </w:r>
+      <w:r>
+        <w:rPr>
+          <w:rFonts w:ascii="Calibri" w:hAnsi="Calibri" w:cs="Calibri"/>
+        </w:rPr>
+        <w:t>:</w:t>
+      </w:r>
+    </w:p>
+    <w:p>
+      <w:pPr>
+        <w:pStyle w:val="ListParagraph"/>
+        <w:numPr>
+          <w:ilvl w:val="1"/>
+          <w:numId w:val="21"/>
+        </w:numPr>
+      </w:pPr>
+      <w:r>
+        <w:t>Analysis:</w:t>
+      </w:r>
+    </w:p>
+    <w:p>
+      <w:pPr>
+        <w:pStyle w:val="ListParagraph"/>
+        <w:numPr>
+          <w:ilvl w:val="2"/>
+          <w:numId w:val="21"/>
+        </w:numPr>
+      </w:pPr>
+      <w:r>
+        <w:t>Grouping</w:t>
+      </w:r>
+      <w:r>
+        <w:t xml:space="preserve"> children into distinct growth categories based on their zBMI at 24 months, then examining whether maternal factors predict which group a child belongs to. </w:t>
+      </w:r>
+    </w:p>
+    <w:p>
+      <w:pPr>
+        <w:pStyle w:val="ListParagraph"/>
+        <w:numPr>
+          <w:ilvl w:val="2"/>
+          <w:numId w:val="21"/>
+        </w:numPr>
+      </w:pPr>
+      <w:r>
+        <w:t>A</w:t>
+      </w:r>
+      <w:r>
+        <w:t xml:space="preserve"> cross-sectional clustering on a single continuous variable</w:t>
+      </w:r>
+      <w:r>
+        <w:t xml:space="preserve">, not </w:t>
+      </w:r>
+      <w:r>
+        <w:t>longitudinal</w:t>
+      </w:r>
+      <w:r>
+        <w:t>.</w:t>
+      </w:r>
+    </w:p>
+    <w:p>
+      <w:pPr>
+        <w:pStyle w:val="ListParagraph"/>
+        <w:numPr>
+          <w:ilvl w:val="1"/>
+          <w:numId w:val="21"/>
+        </w:numPr>
+      </w:pPr>
+      <w:r>
+        <w:t>Steps:</w:t>
+      </w:r>
+    </w:p>
+    <w:p>
+      <w:pPr>
+        <w:pStyle w:val="ListParagraph"/>
+        <w:numPr>
+          <w:ilvl w:val="2"/>
+          <w:numId w:val="21"/>
+        </w:numPr>
+      </w:pPr>
+      <w:r>
+        <w:t xml:space="preserve">Scale the data </w:t>
+      </w:r>
+    </w:p>
+    <w:p>
+      <w:pPr>
+        <w:pStyle w:val="ListParagraph"/>
+        <w:numPr>
+          <w:ilvl w:val="2"/>
+          <w:numId w:val="21"/>
+        </w:numPr>
+      </w:pPr>
+      <w:r>
+        <w:t>Determine K value</w:t>
+      </w:r>
+    </w:p>
+    <w:p>
+      <w:pPr>
+        <w:pStyle w:val="ListParagraph"/>
+        <w:numPr>
+          <w:ilvl w:val="3"/>
+          <w:numId w:val="21"/>
+        </w:numPr>
+      </w:pPr>
+      <w:r>
+        <w:t>Run all NBClust, Elbow method, and Silhouette score</w:t>
+      </w:r>
+    </w:p>
+    <w:p>
+      <w:pPr>
+        <w:pStyle w:val="ListParagraph"/>
+        <w:numPr>
+          <w:ilvl w:val="2"/>
+          <w:numId w:val="21"/>
+        </w:numPr>
+      </w:pPr>
+      <w:r>
+        <w:t>Run clustering algorithms</w:t>
+      </w:r>
+    </w:p>
+    <w:p>
+      <w:pPr>
+        <w:pStyle w:val="ListParagraph"/>
+        <w:numPr>
+          <w:ilvl w:val="3"/>
+          <w:numId w:val="21"/>
+        </w:numPr>
+      </w:pPr>
+      <w:r>
+        <w:t xml:space="preserve">Run all K-mean, PAM, Hierarchical clustering </w:t>
+      </w:r>
+    </w:p>
+    <w:p>
+      <w:pPr>
+        <w:pStyle w:val="ListParagraph"/>
+        <w:numPr>
+          <w:ilvl w:val="3"/>
+          <w:numId w:val="21"/>
+        </w:numPr>
+      </w:pPr>
+      <w:r>
+        <w:t>Compare the three and choose the most stable one to label</w:t>
+      </w:r>
+    </w:p>
+    <w:p>
+      <w:pPr>
+        <w:pStyle w:val="ListParagraph"/>
+        <w:numPr>
+          <w:ilvl w:val="0"/>
+          <w:numId w:val="22"/>
+        </w:numPr>
+        <w:rPr>
+          <w:rFonts w:ascii="Calibri" w:hAnsi="Calibri" w:cs="Calibri"/>
+          <w:b/>
+          <w:bCs/>
+        </w:rPr>
+      </w:pPr>
+      <w:r>
+        <w:rPr>
+          <w:b/>
+          <w:bCs/>
+        </w:rPr>
+        <w:t>Cluster Growth Trajectories</w:t>
+      </w:r>
+    </w:p>
+    <w:p>
+      <w:pPr>
+        <w:pStyle w:val="ListParagraph"/>
+        <w:numPr>
+          <w:ilvl w:val="0"/>
+          <w:numId w:val="24"/>
+        </w:numPr>
+      </w:pPr>
+      <w:r>
+        <w:t>Plot trajectories</w:t>
+      </w:r>
+    </w:p>
+    <w:p>
+      <w:pPr>
+        <w:pStyle w:val="ListParagraph"/>
+        <w:numPr>
+          <w:ilvl w:val="1"/>
+          <w:numId w:val="24"/>
+        </w:numPr>
+      </w:pPr>
+      <w:r>
+        <w:t>g</w:t>
+      </w:r>
+      <w:r>
+        <w:t>gplot</w:t>
+      </w:r>
+      <w:r>
+        <w:t xml:space="preserve"> and </w:t>
+      </w:r>
+      <w:r>
+        <w:t>group by cluster</w:t>
+      </w:r>
+    </w:p>
+    <w:p>
+      <w:pPr>
+        <w:pStyle w:val="ListParagraph"/>
+        <w:numPr>
+          <w:ilvl w:val="3"/>
+          <w:numId w:val="24"/>
+        </w:numPr>
+      </w:pPr>
+      <w:r>
+        <w:t>X-axis: zBMI at 24m</w:t>
+      </w:r>
+    </w:p>
+    <w:p>
+      <w:pPr>
+        <w:pStyle w:val="ListParagraph"/>
+        <w:numPr>
+          <w:ilvl w:val="3"/>
+          <w:numId w:val="24"/>
+        </w:numPr>
+      </w:pPr>
+      <w:r>
+        <w:t xml:space="preserve">Y-axis: Density </w:t>
+      </w:r>
+    </w:p>
+    <w:p>
+      <w:pPr>
+        <w:pStyle w:val="ListParagraph"/>
+        <w:numPr>
+          <w:ilvl w:val="3"/>
+          <w:numId w:val="24"/>
+        </w:numPr>
+      </w:pPr>
+      <w:r>
+        <w:t xml:space="preserve">Plot: </w:t>
+      </w:r>
+      <w:r>
+        <w:t>zBMI Distribution by Growth Cluster</w:t>
+      </w:r>
+    </w:p>
+    <w:p>
+      <w:pPr>
+        <w:pStyle w:val="ListParagraph"/>
+        <w:numPr>
+          <w:ilvl w:val="1"/>
+          <w:numId w:val="24"/>
+        </w:numPr>
+      </w:pPr>
+      <w:r>
+        <w:t>Dendrogram (from hierarchical clustering</w:t>
+      </w:r>
+      <w:r>
+        <w:t>, if using</w:t>
+      </w:r>
+      <w:r>
+        <w:t>)</w:t>
+      </w:r>
+    </w:p>
+    <w:p>
+      <w:pPr>
+        <w:pStyle w:val="ListParagraph"/>
+        <w:numPr>
+          <w:ilvl w:val="3"/>
+          <w:numId w:val="24"/>
+        </w:numPr>
+      </w:pPr>
+      <w:r>
+        <w:t xml:space="preserve">Plot: </w:t>
+      </w:r>
+      <w:r>
+        <w:t>Hierarchical Clustering Dendrogram</w:t>
+      </w:r>
+    </w:p>
+    <w:p/>
     <w:p>
       <w:pPr>
         <w:rPr>
@@ -6181,6 +7385,119 @@
     </w:lvl>
   </w:abstractNum>
   <w:abstractNum w:abstractNumId="1" w15:restartNumberingAfterBreak="0">
+    <w:nsid w:val="11CF5EE9"/>
+    <w:multiLevelType w:val="hybridMultilevel"/>
+    <w:tmpl w:val="8D183E3A"/>
+    <w:lvl w:ilvl="0" w:tplc="10090001">
+      <w:start w:val="1"/>
+      <w:numFmt w:val="bullet"/>
+      <w:lvlText w:val=""/>
+      <w:lvlJc w:val="left"/>
+      <w:pPr>
+        <w:ind w:left="720" w:hanging="360"/>
+      </w:pPr>
+      <w:rPr>
+        <w:rFonts w:ascii="Symbol" w:hAnsi="Symbol" w:hint="default"/>
+      </w:rPr>
+    </w:lvl>
+    <w:lvl w:ilvl="1" w:tplc="10090003">
+      <w:start w:val="1"/>
+      <w:numFmt w:val="bullet"/>
+      <w:lvlText w:val="o"/>
+      <w:lvlJc w:val="left"/>
+      <w:pPr>
+        <w:ind w:left="1440" w:hanging="360"/>
+      </w:pPr>
+      <w:rPr>
+        <w:rFonts w:ascii="Courier New" w:hAnsi="Courier New" w:cs="Courier New" w:hint="default"/>
+      </w:rPr>
+    </w:lvl>
+    <w:lvl w:ilvl="2" w:tplc="10090005">
+      <w:start w:val="1"/>
+      <w:numFmt w:val="bullet"/>
+      <w:lvlText w:val=""/>
+      <w:lvlJc w:val="left"/>
+      <w:pPr>
+        <w:ind w:left="2160" w:hanging="360"/>
+      </w:pPr>
+      <w:rPr>
+        <w:rFonts w:ascii="Wingdings" w:hAnsi="Wingdings" w:hint="default"/>
+      </w:rPr>
+    </w:lvl>
+    <w:lvl w:ilvl="3" w:tplc="10090001">
+      <w:start w:val="1"/>
+      <w:numFmt w:val="bullet"/>
+      <w:lvlText w:val=""/>
+      <w:lvlJc w:val="left"/>
+      <w:pPr>
+        <w:ind w:left="2880" w:hanging="360"/>
+      </w:pPr>
+      <w:rPr>
+        <w:rFonts w:ascii="Symbol" w:hAnsi="Symbol" w:hint="default"/>
+      </w:rPr>
+    </w:lvl>
+    <w:lvl w:ilvl="4" w:tplc="10090003" w:tentative="1">
+      <w:start w:val="1"/>
+      <w:numFmt w:val="bullet"/>
+      <w:lvlText w:val="o"/>
+      <w:lvlJc w:val="left"/>
+      <w:pPr>
+        <w:ind w:left="3600" w:hanging="360"/>
+      </w:pPr>
+      <w:rPr>
+        <w:rFonts w:ascii="Courier New" w:hAnsi="Courier New" w:cs="Courier New" w:hint="default"/>
+      </w:rPr>
+    </w:lvl>
+    <w:lvl w:ilvl="5" w:tplc="10090005" w:tentative="1">
+      <w:start w:val="1"/>
+      <w:numFmt w:val="bullet"/>
+      <w:lvlText w:val=""/>
+      <w:lvlJc w:val="left"/>
+      <w:pPr>
+        <w:ind w:left="4320" w:hanging="360"/>
+      </w:pPr>
+      <w:rPr>
+        <w:rFonts w:ascii="Wingdings" w:hAnsi="Wingdings" w:hint="default"/>
+      </w:rPr>
+    </w:lvl>
+    <w:lvl w:ilvl="6" w:tplc="10090001" w:tentative="1">
+      <w:start w:val="1"/>
+      <w:numFmt w:val="bullet"/>
+      <w:lvlText w:val=""/>
+      <w:lvlJc w:val="left"/>
+      <w:pPr>
+        <w:ind w:left="5040" w:hanging="360"/>
+      </w:pPr>
+      <w:rPr>
+        <w:rFonts w:ascii="Symbol" w:hAnsi="Symbol" w:hint="default"/>
+      </w:rPr>
+    </w:lvl>
+    <w:lvl w:ilvl="7" w:tplc="10090003" w:tentative="1">
+      <w:start w:val="1"/>
+      <w:numFmt w:val="bullet"/>
+      <w:lvlText w:val="o"/>
+      <w:lvlJc w:val="left"/>
+      <w:pPr>
+        <w:ind w:left="5760" w:hanging="360"/>
+      </w:pPr>
+      <w:rPr>
+        <w:rFonts w:ascii="Courier New" w:hAnsi="Courier New" w:cs="Courier New" w:hint="default"/>
+      </w:rPr>
+    </w:lvl>
+    <w:lvl w:ilvl="8" w:tplc="10090005" w:tentative="1">
+      <w:start w:val="1"/>
+      <w:numFmt w:val="bullet"/>
+      <w:lvlText w:val=""/>
+      <w:lvlJc w:val="left"/>
+      <w:pPr>
+        <w:ind w:left="6480" w:hanging="360"/>
+      </w:pPr>
+      <w:rPr>
+        <w:rFonts w:ascii="Wingdings" w:hAnsi="Wingdings" w:hint="default"/>
+      </w:rPr>
+    </w:lvl>
+  </w:abstractNum>
+  <w:abstractNum w:abstractNumId="2" w15:restartNumberingAfterBreak="0">
     <w:nsid w:val="20AF16BA"/>
     <w:multiLevelType w:val="hybridMultilevel"/>
     <w:tmpl w:val="967A6EA8"/>
@@ -6293,7 +7610,7 @@
       </w:rPr>
     </w:lvl>
   </w:abstractNum>
-  <w:abstractNum w:abstractNumId="2" w15:restartNumberingAfterBreak="0">
+  <w:abstractNum w:abstractNumId="3" w15:restartNumberingAfterBreak="0">
     <w:nsid w:val="265DD489"/>
     <w:multiLevelType w:val="hybridMultilevel"/>
     <w:tmpl w:val="D220B10A"/>
@@ -6383,7 +7700,7 @@
       </w:pPr>
     </w:lvl>
   </w:abstractNum>
-  <w:abstractNum w:abstractNumId="3" w15:restartNumberingAfterBreak="0">
+  <w:abstractNum w:abstractNumId="4" w15:restartNumberingAfterBreak="0">
     <w:nsid w:val="27302C4C"/>
     <w:multiLevelType w:val="hybridMultilevel"/>
     <w:tmpl w:val="FFFFFFFF"/>
@@ -6496,120 +7813,120 @@
       </w:rPr>
     </w:lvl>
   </w:abstractNum>
-  <w:abstractNum w:abstractNumId="4" w15:restartNumberingAfterBreak="0">
+  <w:abstractNum w:abstractNumId="5" w15:restartNumberingAfterBreak="0">
     <w:nsid w:val="2CD33415"/>
     <w:multiLevelType w:val="hybridMultilevel"/>
-    <w:tmpl w:val="FA7859CC"/>
-    <w:lvl w:ilvl="0" w:tplc="47A27530">
+    <w:tmpl w:val="31422A96"/>
+    <w:lvl w:ilvl="0" w:tplc="482C383A">
+      <w:start w:val="1"/>
+      <w:numFmt w:val="decimal"/>
+      <w:lvlText w:val="%1)"/>
+      <w:lvlJc w:val="left"/>
+      <w:pPr>
+        <w:ind w:left="720" w:hanging="360"/>
+      </w:pPr>
+      <w:rPr>
+        <w:rFonts w:ascii="Calibri" w:eastAsiaTheme="minorEastAsia" w:hAnsi="Calibri" w:cs="Calibri"/>
+      </w:rPr>
+    </w:lvl>
+    <w:lvl w:ilvl="1" w:tplc="570E493A">
+      <w:start w:val="1"/>
+      <w:numFmt w:val="bullet"/>
+      <w:lvlText w:val="o"/>
+      <w:lvlJc w:val="left"/>
+      <w:pPr>
+        <w:ind w:left="1440" w:hanging="360"/>
+      </w:pPr>
+      <w:rPr>
+        <w:rFonts w:ascii="Courier New" w:hAnsi="Courier New" w:hint="default"/>
+      </w:rPr>
+    </w:lvl>
+    <w:lvl w:ilvl="2" w:tplc="82D0D4DA">
+      <w:start w:val="1"/>
+      <w:numFmt w:val="bullet"/>
+      <w:lvlText w:val=""/>
+      <w:lvlJc w:val="left"/>
+      <w:pPr>
+        <w:ind w:left="2160" w:hanging="360"/>
+      </w:pPr>
+      <w:rPr>
+        <w:rFonts w:ascii="Wingdings" w:hAnsi="Wingdings" w:hint="default"/>
+      </w:rPr>
+    </w:lvl>
+    <w:lvl w:ilvl="3" w:tplc="29B8F3FA">
       <w:start w:val="1"/>
       <w:numFmt w:val="bullet"/>
       <w:lvlText w:val=""/>
       <w:lvlJc w:val="left"/>
       <w:pPr>
-        <w:ind w:left="720" w:hanging="360"/>
+        <w:ind w:left="2880" w:hanging="360"/>
       </w:pPr>
       <w:rPr>
         <w:rFonts w:ascii="Symbol" w:hAnsi="Symbol" w:hint="default"/>
       </w:rPr>
     </w:lvl>
-    <w:lvl w:ilvl="1" w:tplc="570E493A">
+    <w:lvl w:ilvl="4" w:tplc="42344068">
       <w:start w:val="1"/>
       <w:numFmt w:val="bullet"/>
       <w:lvlText w:val="o"/>
       <w:lvlJc w:val="left"/>
       <w:pPr>
-        <w:ind w:left="1440" w:hanging="360"/>
+        <w:ind w:left="3600" w:hanging="360"/>
       </w:pPr>
       <w:rPr>
         <w:rFonts w:ascii="Courier New" w:hAnsi="Courier New" w:hint="default"/>
       </w:rPr>
     </w:lvl>
-    <w:lvl w:ilvl="2" w:tplc="82D0D4DA">
+    <w:lvl w:ilvl="5" w:tplc="3844F05C">
       <w:start w:val="1"/>
       <w:numFmt w:val="bullet"/>
       <w:lvlText w:val=""/>
       <w:lvlJc w:val="left"/>
       <w:pPr>
-        <w:ind w:left="2160" w:hanging="360"/>
+        <w:ind w:left="4320" w:hanging="360"/>
       </w:pPr>
       <w:rPr>
         <w:rFonts w:ascii="Wingdings" w:hAnsi="Wingdings" w:hint="default"/>
       </w:rPr>
     </w:lvl>
-    <w:lvl w:ilvl="3" w:tplc="29B8F3FA">
+    <w:lvl w:ilvl="6" w:tplc="8EEEAE6E">
       <w:start w:val="1"/>
       <w:numFmt w:val="bullet"/>
       <w:lvlText w:val=""/>
       <w:lvlJc w:val="left"/>
       <w:pPr>
-        <w:ind w:left="2880" w:hanging="360"/>
+        <w:ind w:left="5040" w:hanging="360"/>
       </w:pPr>
       <w:rPr>
         <w:rFonts w:ascii="Symbol" w:hAnsi="Symbol" w:hint="default"/>
       </w:rPr>
     </w:lvl>
-    <w:lvl w:ilvl="4" w:tplc="42344068">
+    <w:lvl w:ilvl="7" w:tplc="51A4682E">
       <w:start w:val="1"/>
       <w:numFmt w:val="bullet"/>
       <w:lvlText w:val="o"/>
       <w:lvlJc w:val="left"/>
       <w:pPr>
-        <w:ind w:left="3600" w:hanging="360"/>
+        <w:ind w:left="5760" w:hanging="360"/>
       </w:pPr>
       <w:rPr>
         <w:rFonts w:ascii="Courier New" w:hAnsi="Courier New" w:hint="default"/>
       </w:rPr>
     </w:lvl>
-    <w:lvl w:ilvl="5" w:tplc="3844F05C">
+    <w:lvl w:ilvl="8" w:tplc="31561B48">
       <w:start w:val="1"/>
       <w:numFmt w:val="bullet"/>
       <w:lvlText w:val=""/>
       <w:lvlJc w:val="left"/>
       <w:pPr>
-        <w:ind w:left="4320" w:hanging="360"/>
+        <w:ind w:left="6480" w:hanging="360"/>
       </w:pPr>
       <w:rPr>
         <w:rFonts w:ascii="Wingdings" w:hAnsi="Wingdings" w:hint="default"/>
       </w:rPr>
     </w:lvl>
-    <w:lvl w:ilvl="6" w:tplc="8EEEAE6E">
-      <w:start w:val="1"/>
-      <w:numFmt w:val="bullet"/>
-      <w:lvlText w:val=""/>
-      <w:lvlJc w:val="left"/>
-      <w:pPr>
-        <w:ind w:left="5040" w:hanging="360"/>
-      </w:pPr>
-      <w:rPr>
-        <w:rFonts w:ascii="Symbol" w:hAnsi="Symbol" w:hint="default"/>
-      </w:rPr>
-    </w:lvl>
-    <w:lvl w:ilvl="7" w:tplc="51A4682E">
-      <w:start w:val="1"/>
-      <w:numFmt w:val="bullet"/>
-      <w:lvlText w:val="o"/>
-      <w:lvlJc w:val="left"/>
-      <w:pPr>
-        <w:ind w:left="5760" w:hanging="360"/>
-      </w:pPr>
-      <w:rPr>
-        <w:rFonts w:ascii="Courier New" w:hAnsi="Courier New" w:hint="default"/>
-      </w:rPr>
-    </w:lvl>
-    <w:lvl w:ilvl="8" w:tplc="31561B48">
-      <w:start w:val="1"/>
-      <w:numFmt w:val="bullet"/>
-      <w:lvlText w:val=""/>
-      <w:lvlJc w:val="left"/>
-      <w:pPr>
-        <w:ind w:left="6480" w:hanging="360"/>
-      </w:pPr>
-      <w:rPr>
-        <w:rFonts w:ascii="Wingdings" w:hAnsi="Wingdings" w:hint="default"/>
-      </w:rPr>
-    </w:lvl>
   </w:abstractNum>
-  <w:abstractNum w:abstractNumId="5" w15:restartNumberingAfterBreak="0">
+  <w:abstractNum w:abstractNumId="6" w15:restartNumberingAfterBreak="0">
     <w:nsid w:val="30F97B10"/>
     <w:multiLevelType w:val="hybridMultilevel"/>
     <w:tmpl w:val="B66CFBF4"/>
@@ -6722,7 +8039,7 @@
       </w:rPr>
     </w:lvl>
   </w:abstractNum>
-  <w:abstractNum w:abstractNumId="6" w15:restartNumberingAfterBreak="0">
+  <w:abstractNum w:abstractNumId="7" w15:restartNumberingAfterBreak="0">
     <w:nsid w:val="361E6879"/>
     <w:multiLevelType w:val="hybridMultilevel"/>
     <w:tmpl w:val="51CEDCC4"/>
@@ -6835,7 +8152,7 @@
       </w:rPr>
     </w:lvl>
   </w:abstractNum>
-  <w:abstractNum w:abstractNumId="7" w15:restartNumberingAfterBreak="0">
+  <w:abstractNum w:abstractNumId="8" w15:restartNumberingAfterBreak="0">
     <w:nsid w:val="3EB73EF6"/>
     <w:multiLevelType w:val="hybridMultilevel"/>
     <w:tmpl w:val="6E02CB14"/>
@@ -6948,7 +8265,96 @@
       </w:rPr>
     </w:lvl>
   </w:abstractNum>
-  <w:abstractNum w:abstractNumId="8" w15:restartNumberingAfterBreak="0">
+  <w:abstractNum w:abstractNumId="9" w15:restartNumberingAfterBreak="0">
+    <w:nsid w:val="420A3442"/>
+    <w:multiLevelType w:val="hybridMultilevel"/>
+    <w:tmpl w:val="85CC8924"/>
+    <w:lvl w:ilvl="0" w:tplc="10090011">
+      <w:start w:val="1"/>
+      <w:numFmt w:val="decimal"/>
+      <w:lvlText w:val="%1)"/>
+      <w:lvlJc w:val="left"/>
+      <w:pPr>
+        <w:ind w:left="720" w:hanging="360"/>
+      </w:pPr>
+      <w:rPr>
+        <w:rFonts w:hint="default"/>
+      </w:rPr>
+    </w:lvl>
+    <w:lvl w:ilvl="1" w:tplc="10090019" w:tentative="1">
+      <w:start w:val="1"/>
+      <w:numFmt w:val="lowerLetter"/>
+      <w:lvlText w:val="%2."/>
+      <w:lvlJc w:val="left"/>
+      <w:pPr>
+        <w:ind w:left="1440" w:hanging="360"/>
+      </w:pPr>
+    </w:lvl>
+    <w:lvl w:ilvl="2" w:tplc="1009001B" w:tentative="1">
+      <w:start w:val="1"/>
+      <w:numFmt w:val="lowerRoman"/>
+      <w:lvlText w:val="%3."/>
+      <w:lvlJc w:val="right"/>
+      <w:pPr>
+        <w:ind w:left="2160" w:hanging="180"/>
+      </w:pPr>
+    </w:lvl>
+    <w:lvl w:ilvl="3" w:tplc="1009000F" w:tentative="1">
+      <w:start w:val="1"/>
+      <w:numFmt w:val="decimal"/>
+      <w:lvlText w:val="%4."/>
+      <w:lvlJc w:val="left"/>
+      <w:pPr>
+        <w:ind w:left="2880" w:hanging="360"/>
+      </w:pPr>
+    </w:lvl>
+    <w:lvl w:ilvl="4" w:tplc="10090019" w:tentative="1">
+      <w:start w:val="1"/>
+      <w:numFmt w:val="lowerLetter"/>
+      <w:lvlText w:val="%5."/>
+      <w:lvlJc w:val="left"/>
+      <w:pPr>
+        <w:ind w:left="3600" w:hanging="360"/>
+      </w:pPr>
+    </w:lvl>
+    <w:lvl w:ilvl="5" w:tplc="1009001B" w:tentative="1">
+      <w:start w:val="1"/>
+      <w:numFmt w:val="lowerRoman"/>
+      <w:lvlText w:val="%6."/>
+      <w:lvlJc w:val="right"/>
+      <w:pPr>
+        <w:ind w:left="4320" w:hanging="180"/>
+      </w:pPr>
+    </w:lvl>
+    <w:lvl w:ilvl="6" w:tplc="1009000F" w:tentative="1">
+      <w:start w:val="1"/>
+      <w:numFmt w:val="decimal"/>
+      <w:lvlText w:val="%7."/>
+      <w:lvlJc w:val="left"/>
+      <w:pPr>
+        <w:ind w:left="5040" w:hanging="360"/>
+      </w:pPr>
+    </w:lvl>
+    <w:lvl w:ilvl="7" w:tplc="10090019" w:tentative="1">
+      <w:start w:val="1"/>
+      <w:numFmt w:val="lowerLetter"/>
+      <w:lvlText w:val="%8."/>
+      <w:lvlJc w:val="left"/>
+      <w:pPr>
+        <w:ind w:left="5760" w:hanging="360"/>
+      </w:pPr>
+    </w:lvl>
+    <w:lvl w:ilvl="8" w:tplc="1009001B" w:tentative="1">
+      <w:start w:val="1"/>
+      <w:numFmt w:val="lowerRoman"/>
+      <w:lvlText w:val="%9."/>
+      <w:lvlJc w:val="right"/>
+      <w:pPr>
+        <w:ind w:left="6480" w:hanging="180"/>
+      </w:pPr>
+    </w:lvl>
+  </w:abstractNum>
+  <w:abstractNum w:abstractNumId="10" w15:restartNumberingAfterBreak="0">
     <w:nsid w:val="452A0133"/>
     <w:multiLevelType w:val="hybridMultilevel"/>
     <w:tmpl w:val="39562412"/>
@@ -7061,7 +8467,7 @@
       </w:rPr>
     </w:lvl>
   </w:abstractNum>
-  <w:abstractNum w:abstractNumId="9" w15:restartNumberingAfterBreak="0">
+  <w:abstractNum w:abstractNumId="11" w15:restartNumberingAfterBreak="0">
     <w:nsid w:val="464B78D8"/>
     <w:multiLevelType w:val="hybridMultilevel"/>
     <w:tmpl w:val="72C2FAB2"/>
@@ -7174,7 +8580,7 @@
       </w:rPr>
     </w:lvl>
   </w:abstractNum>
-  <w:abstractNum w:abstractNumId="10" w15:restartNumberingAfterBreak="0">
+  <w:abstractNum w:abstractNumId="12" w15:restartNumberingAfterBreak="0">
     <w:nsid w:val="472E7ACB"/>
     <w:multiLevelType w:val="hybridMultilevel"/>
     <w:tmpl w:val="3E4436A8"/>
@@ -7287,7 +8693,7 @@
       </w:rPr>
     </w:lvl>
   </w:abstractNum>
-  <w:abstractNum w:abstractNumId="11" w15:restartNumberingAfterBreak="0">
+  <w:abstractNum w:abstractNumId="13" w15:restartNumberingAfterBreak="0">
     <w:nsid w:val="55019AA7"/>
     <w:multiLevelType w:val="hybridMultilevel"/>
     <w:tmpl w:val="B1C2D834"/>
@@ -7373,7 +8779,7 @@
       </w:pPr>
     </w:lvl>
   </w:abstractNum>
-  <w:abstractNum w:abstractNumId="12" w15:restartNumberingAfterBreak="0">
+  <w:abstractNum w:abstractNumId="14" w15:restartNumberingAfterBreak="0">
     <w:nsid w:val="56053B35"/>
     <w:multiLevelType w:val="hybridMultilevel"/>
     <w:tmpl w:val="5A7E04A6"/>
@@ -7486,7 +8892,7 @@
       </w:rPr>
     </w:lvl>
   </w:abstractNum>
-  <w:abstractNum w:abstractNumId="13" w15:restartNumberingAfterBreak="0">
+  <w:abstractNum w:abstractNumId="15" w15:restartNumberingAfterBreak="0">
     <w:nsid w:val="5FE92AD8"/>
     <w:multiLevelType w:val="hybridMultilevel"/>
     <w:tmpl w:val="A11AF00A"/>
@@ -7599,7 +9005,209 @@
       </w:rPr>
     </w:lvl>
   </w:abstractNum>
-  <w:abstractNum w:abstractNumId="14" w15:restartNumberingAfterBreak="0">
+  <w:abstractNum w:abstractNumId="16" w15:restartNumberingAfterBreak="0">
+    <w:nsid w:val="63EF2058"/>
+    <w:multiLevelType w:val="hybridMultilevel"/>
+    <w:tmpl w:val="D47AE2EE"/>
+    <w:lvl w:ilvl="0" w:tplc="1009000F">
+      <w:start w:val="1"/>
+      <w:numFmt w:val="decimal"/>
+      <w:lvlText w:val="%1."/>
+      <w:lvlJc w:val="left"/>
+      <w:pPr>
+        <w:ind w:left="720" w:hanging="360"/>
+      </w:pPr>
+      <w:rPr>
+        <w:rFonts w:hint="default"/>
+      </w:rPr>
+    </w:lvl>
+    <w:lvl w:ilvl="1" w:tplc="10090019">
+      <w:start w:val="1"/>
+      <w:numFmt w:val="lowerLetter"/>
+      <w:lvlText w:val="%2."/>
+      <w:lvlJc w:val="left"/>
+      <w:pPr>
+        <w:ind w:left="1440" w:hanging="360"/>
+      </w:pPr>
+    </w:lvl>
+    <w:lvl w:ilvl="2" w:tplc="1009001B">
+      <w:start w:val="1"/>
+      <w:numFmt w:val="lowerRoman"/>
+      <w:lvlText w:val="%3."/>
+      <w:lvlJc w:val="right"/>
+      <w:pPr>
+        <w:ind w:left="2160" w:hanging="180"/>
+      </w:pPr>
+    </w:lvl>
+    <w:lvl w:ilvl="3" w:tplc="1009000F" w:tentative="1">
+      <w:start w:val="1"/>
+      <w:numFmt w:val="decimal"/>
+      <w:lvlText w:val="%4."/>
+      <w:lvlJc w:val="left"/>
+      <w:pPr>
+        <w:ind w:left="2880" w:hanging="360"/>
+      </w:pPr>
+    </w:lvl>
+    <w:lvl w:ilvl="4" w:tplc="10090019" w:tentative="1">
+      <w:start w:val="1"/>
+      <w:numFmt w:val="lowerLetter"/>
+      <w:lvlText w:val="%5."/>
+      <w:lvlJc w:val="left"/>
+      <w:pPr>
+        <w:ind w:left="3600" w:hanging="360"/>
+      </w:pPr>
+    </w:lvl>
+    <w:lvl w:ilvl="5" w:tplc="1009001B" w:tentative="1">
+      <w:start w:val="1"/>
+      <w:numFmt w:val="lowerRoman"/>
+      <w:lvlText w:val="%6."/>
+      <w:lvlJc w:val="right"/>
+      <w:pPr>
+        <w:ind w:left="4320" w:hanging="180"/>
+      </w:pPr>
+    </w:lvl>
+    <w:lvl w:ilvl="6" w:tplc="1009000F" w:tentative="1">
+      <w:start w:val="1"/>
+      <w:numFmt w:val="decimal"/>
+      <w:lvlText w:val="%7."/>
+      <w:lvlJc w:val="left"/>
+      <w:pPr>
+        <w:ind w:left="5040" w:hanging="360"/>
+      </w:pPr>
+    </w:lvl>
+    <w:lvl w:ilvl="7" w:tplc="10090019" w:tentative="1">
+      <w:start w:val="1"/>
+      <w:numFmt w:val="lowerLetter"/>
+      <w:lvlText w:val="%8."/>
+      <w:lvlJc w:val="left"/>
+      <w:pPr>
+        <w:ind w:left="5760" w:hanging="360"/>
+      </w:pPr>
+    </w:lvl>
+    <w:lvl w:ilvl="8" w:tplc="1009001B" w:tentative="1">
+      <w:start w:val="1"/>
+      <w:numFmt w:val="lowerRoman"/>
+      <w:lvlText w:val="%9."/>
+      <w:lvlJc w:val="right"/>
+      <w:pPr>
+        <w:ind w:left="6480" w:hanging="180"/>
+      </w:pPr>
+    </w:lvl>
+  </w:abstractNum>
+  <w:abstractNum w:abstractNumId="17" w15:restartNumberingAfterBreak="0">
+    <w:nsid w:val="67904850"/>
+    <w:multiLevelType w:val="hybridMultilevel"/>
+    <w:tmpl w:val="AF328482"/>
+    <w:lvl w:ilvl="0" w:tplc="10090001">
+      <w:start w:val="1"/>
+      <w:numFmt w:val="bullet"/>
+      <w:lvlText w:val=""/>
+      <w:lvlJc w:val="left"/>
+      <w:pPr>
+        <w:ind w:left="1080" w:hanging="360"/>
+      </w:pPr>
+      <w:rPr>
+        <w:rFonts w:ascii="Symbol" w:hAnsi="Symbol" w:hint="default"/>
+      </w:rPr>
+    </w:lvl>
+    <w:lvl w:ilvl="1" w:tplc="10090003">
+      <w:start w:val="1"/>
+      <w:numFmt w:val="bullet"/>
+      <w:lvlText w:val="o"/>
+      <w:lvlJc w:val="left"/>
+      <w:pPr>
+        <w:ind w:left="1800" w:hanging="360"/>
+      </w:pPr>
+      <w:rPr>
+        <w:rFonts w:ascii="Courier New" w:hAnsi="Courier New" w:cs="Courier New" w:hint="default"/>
+      </w:rPr>
+    </w:lvl>
+    <w:lvl w:ilvl="2" w:tplc="10090005">
+      <w:start w:val="1"/>
+      <w:numFmt w:val="bullet"/>
+      <w:lvlText w:val=""/>
+      <w:lvlJc w:val="left"/>
+      <w:pPr>
+        <w:ind w:left="2520" w:hanging="360"/>
+      </w:pPr>
+      <w:rPr>
+        <w:rFonts w:ascii="Wingdings" w:hAnsi="Wingdings" w:hint="default"/>
+      </w:rPr>
+    </w:lvl>
+    <w:lvl w:ilvl="3" w:tplc="10090001">
+      <w:start w:val="1"/>
+      <w:numFmt w:val="bullet"/>
+      <w:lvlText w:val=""/>
+      <w:lvlJc w:val="left"/>
+      <w:pPr>
+        <w:ind w:left="3240" w:hanging="360"/>
+      </w:pPr>
+      <w:rPr>
+        <w:rFonts w:ascii="Symbol" w:hAnsi="Symbol" w:hint="default"/>
+      </w:rPr>
+    </w:lvl>
+    <w:lvl w:ilvl="4" w:tplc="10090003" w:tentative="1">
+      <w:start w:val="1"/>
+      <w:numFmt w:val="bullet"/>
+      <w:lvlText w:val="o"/>
+      <w:lvlJc w:val="left"/>
+      <w:pPr>
+        <w:ind w:left="3960" w:hanging="360"/>
+      </w:pPr>
+      <w:rPr>
+        <w:rFonts w:ascii="Courier New" w:hAnsi="Courier New" w:cs="Courier New" w:hint="default"/>
+      </w:rPr>
+    </w:lvl>
+    <w:lvl w:ilvl="5" w:tplc="10090005" w:tentative="1">
+      <w:start w:val="1"/>
+      <w:numFmt w:val="bullet"/>
+      <w:lvlText w:val=""/>
+      <w:lvlJc w:val="left"/>
+      <w:pPr>
+        <w:ind w:left="4680" w:hanging="360"/>
+      </w:pPr>
+      <w:rPr>
+        <w:rFonts w:ascii="Wingdings" w:hAnsi="Wingdings" w:hint="default"/>
+      </w:rPr>
+    </w:lvl>
+    <w:lvl w:ilvl="6" w:tplc="10090001" w:tentative="1">
+      <w:start w:val="1"/>
+      <w:numFmt w:val="bullet"/>
+      <w:lvlText w:val=""/>
+      <w:lvlJc w:val="left"/>
+      <w:pPr>
+        <w:ind w:left="5400" w:hanging="360"/>
+      </w:pPr>
+      <w:rPr>
+        <w:rFonts w:ascii="Symbol" w:hAnsi="Symbol" w:hint="default"/>
+      </w:rPr>
+    </w:lvl>
+    <w:lvl w:ilvl="7" w:tplc="10090003" w:tentative="1">
+      <w:start w:val="1"/>
+      <w:numFmt w:val="bullet"/>
+      <w:lvlText w:val="o"/>
+      <w:lvlJc w:val="left"/>
+      <w:pPr>
+        <w:ind w:left="6120" w:hanging="360"/>
+      </w:pPr>
+      <w:rPr>
+        <w:rFonts w:ascii="Courier New" w:hAnsi="Courier New" w:cs="Courier New" w:hint="default"/>
+      </w:rPr>
+    </w:lvl>
+    <w:lvl w:ilvl="8" w:tplc="10090005" w:tentative="1">
+      <w:start w:val="1"/>
+      <w:numFmt w:val="bullet"/>
+      <w:lvlText w:val=""/>
+      <w:lvlJc w:val="left"/>
+      <w:pPr>
+        <w:ind w:left="6840" w:hanging="360"/>
+      </w:pPr>
+      <w:rPr>
+        <w:rFonts w:ascii="Wingdings" w:hAnsi="Wingdings" w:hint="default"/>
+      </w:rPr>
+    </w:lvl>
+  </w:abstractNum>
+  <w:abstractNum w:abstractNumId="18" w15:restartNumberingAfterBreak="0">
     <w:nsid w:val="696F0A18"/>
     <w:multiLevelType w:val="hybridMultilevel"/>
     <w:tmpl w:val="BC62701C"/>
@@ -7712,7 +9320,120 @@
       </w:rPr>
     </w:lvl>
   </w:abstractNum>
-  <w:abstractNum w:abstractNumId="15" w15:restartNumberingAfterBreak="0">
+  <w:abstractNum w:abstractNumId="19" w15:restartNumberingAfterBreak="0">
+    <w:nsid w:val="71826831"/>
+    <w:multiLevelType w:val="hybridMultilevel"/>
+    <w:tmpl w:val="0E88C85E"/>
+    <w:lvl w:ilvl="0" w:tplc="10090001">
+      <w:start w:val="1"/>
+      <w:numFmt w:val="bullet"/>
+      <w:lvlText w:val=""/>
+      <w:lvlJc w:val="left"/>
+      <w:pPr>
+        <w:ind w:left="1080" w:hanging="360"/>
+      </w:pPr>
+      <w:rPr>
+        <w:rFonts w:ascii="Symbol" w:hAnsi="Symbol" w:hint="default"/>
+      </w:rPr>
+    </w:lvl>
+    <w:lvl w:ilvl="1" w:tplc="10090003">
+      <w:start w:val="1"/>
+      <w:numFmt w:val="bullet"/>
+      <w:lvlText w:val="o"/>
+      <w:lvlJc w:val="left"/>
+      <w:pPr>
+        <w:ind w:left="1800" w:hanging="360"/>
+      </w:pPr>
+      <w:rPr>
+        <w:rFonts w:ascii="Courier New" w:hAnsi="Courier New" w:cs="Courier New" w:hint="default"/>
+      </w:rPr>
+    </w:lvl>
+    <w:lvl w:ilvl="2" w:tplc="10090005">
+      <w:start w:val="1"/>
+      <w:numFmt w:val="bullet"/>
+      <w:lvlText w:val=""/>
+      <w:lvlJc w:val="left"/>
+      <w:pPr>
+        <w:ind w:left="2520" w:hanging="360"/>
+      </w:pPr>
+      <w:rPr>
+        <w:rFonts w:ascii="Wingdings" w:hAnsi="Wingdings" w:hint="default"/>
+      </w:rPr>
+    </w:lvl>
+    <w:lvl w:ilvl="3" w:tplc="10090001">
+      <w:start w:val="1"/>
+      <w:numFmt w:val="bullet"/>
+      <w:lvlText w:val=""/>
+      <w:lvlJc w:val="left"/>
+      <w:pPr>
+        <w:ind w:left="3240" w:hanging="360"/>
+      </w:pPr>
+      <w:rPr>
+        <w:rFonts w:ascii="Symbol" w:hAnsi="Symbol" w:hint="default"/>
+      </w:rPr>
+    </w:lvl>
+    <w:lvl w:ilvl="4" w:tplc="10090003" w:tentative="1">
+      <w:start w:val="1"/>
+      <w:numFmt w:val="bullet"/>
+      <w:lvlText w:val="o"/>
+      <w:lvlJc w:val="left"/>
+      <w:pPr>
+        <w:ind w:left="3960" w:hanging="360"/>
+      </w:pPr>
+      <w:rPr>
+        <w:rFonts w:ascii="Courier New" w:hAnsi="Courier New" w:cs="Courier New" w:hint="default"/>
+      </w:rPr>
+    </w:lvl>
+    <w:lvl w:ilvl="5" w:tplc="10090005" w:tentative="1">
+      <w:start w:val="1"/>
+      <w:numFmt w:val="bullet"/>
+      <w:lvlText w:val=""/>
+      <w:lvlJc w:val="left"/>
+      <w:pPr>
+        <w:ind w:left="4680" w:hanging="360"/>
+      </w:pPr>
+      <w:rPr>
+        <w:rFonts w:ascii="Wingdings" w:hAnsi="Wingdings" w:hint="default"/>
+      </w:rPr>
+    </w:lvl>
+    <w:lvl w:ilvl="6" w:tplc="10090001" w:tentative="1">
+      <w:start w:val="1"/>
+      <w:numFmt w:val="bullet"/>
+      <w:lvlText w:val=""/>
+      <w:lvlJc w:val="left"/>
+      <w:pPr>
+        <w:ind w:left="5400" w:hanging="360"/>
+      </w:pPr>
+      <w:rPr>
+        <w:rFonts w:ascii="Symbol" w:hAnsi="Symbol" w:hint="default"/>
+      </w:rPr>
+    </w:lvl>
+    <w:lvl w:ilvl="7" w:tplc="10090003" w:tentative="1">
+      <w:start w:val="1"/>
+      <w:numFmt w:val="bullet"/>
+      <w:lvlText w:val="o"/>
+      <w:lvlJc w:val="left"/>
+      <w:pPr>
+        <w:ind w:left="6120" w:hanging="360"/>
+      </w:pPr>
+      <w:rPr>
+        <w:rFonts w:ascii="Courier New" w:hAnsi="Courier New" w:cs="Courier New" w:hint="default"/>
+      </w:rPr>
+    </w:lvl>
+    <w:lvl w:ilvl="8" w:tplc="10090005" w:tentative="1">
+      <w:start w:val="1"/>
+      <w:numFmt w:val="bullet"/>
+      <w:lvlText w:val=""/>
+      <w:lvlJc w:val="left"/>
+      <w:pPr>
+        <w:ind w:left="6840" w:hanging="360"/>
+      </w:pPr>
+      <w:rPr>
+        <w:rFonts w:ascii="Wingdings" w:hAnsi="Wingdings" w:hint="default"/>
+      </w:rPr>
+    </w:lvl>
+  </w:abstractNum>
+  <w:abstractNum w:abstractNumId="20" w15:restartNumberingAfterBreak="0">
     <w:nsid w:val="71C6017B"/>
     <w:multiLevelType w:val="hybridMultilevel"/>
     <w:tmpl w:val="A8C4EBCE"/>
@@ -7825,7 +9546,7 @@
       </w:rPr>
     </w:lvl>
   </w:abstractNum>
-  <w:abstractNum w:abstractNumId="16" w15:restartNumberingAfterBreak="0">
+  <w:abstractNum w:abstractNumId="21" w15:restartNumberingAfterBreak="0">
     <w:nsid w:val="7371118C"/>
     <w:multiLevelType w:val="hybridMultilevel"/>
     <w:tmpl w:val="B192D042"/>
@@ -7938,7 +9659,7 @@
       </w:rPr>
     </w:lvl>
   </w:abstractNum>
-  <w:abstractNum w:abstractNumId="17" w15:restartNumberingAfterBreak="0">
+  <w:abstractNum w:abstractNumId="22" w15:restartNumberingAfterBreak="0">
     <w:nsid w:val="7A2F2599"/>
     <w:multiLevelType w:val="hybridMultilevel"/>
     <w:tmpl w:val="3A7E72B4"/>
@@ -8051,7 +9772,7 @@
       </w:rPr>
     </w:lvl>
   </w:abstractNum>
-  <w:abstractNum w:abstractNumId="18" w15:restartNumberingAfterBreak="0">
+  <w:abstractNum w:abstractNumId="23" w15:restartNumberingAfterBreak="0">
     <w:nsid w:val="7C228021"/>
     <w:multiLevelType w:val="hybridMultilevel"/>
     <w:tmpl w:val="FFFFFFFF"/>
@@ -8165,61 +9886,76 @@
     </w:lvl>
   </w:abstractNum>
   <w:num w:numId="1" w16cid:durableId="247466868">
+    <w:abstractNumId w:val="13"/>
+  </w:num>
+  <w:num w:numId="2" w16cid:durableId="972058060">
+    <w:abstractNumId w:val="4"/>
+  </w:num>
+  <w:num w:numId="3" w16cid:durableId="1955867264">
+    <w:abstractNumId w:val="3"/>
+  </w:num>
+  <w:num w:numId="4" w16cid:durableId="514921078">
+    <w:abstractNumId w:val="23"/>
+  </w:num>
+  <w:num w:numId="5" w16cid:durableId="1143085457">
+    <w:abstractNumId w:val="22"/>
+  </w:num>
+  <w:num w:numId="6" w16cid:durableId="1208177020">
+    <w:abstractNumId w:val="12"/>
+  </w:num>
+  <w:num w:numId="7" w16cid:durableId="1032458305">
     <w:abstractNumId w:val="11"/>
   </w:num>
-  <w:num w:numId="2" w16cid:durableId="972058060">
-    <w:abstractNumId w:val="3"/>
-  </w:num>
-  <w:num w:numId="3" w16cid:durableId="1955867264">
+  <w:num w:numId="8" w16cid:durableId="693846444">
     <w:abstractNumId w:val="2"/>
   </w:num>
-  <w:num w:numId="4" w16cid:durableId="514921078">
+  <w:num w:numId="9" w16cid:durableId="527990408">
     <w:abstractNumId w:val="18"/>
   </w:num>
-  <w:num w:numId="5" w16cid:durableId="1143085457">
-    <w:abstractNumId w:val="17"/>
+  <w:num w:numId="10" w16cid:durableId="895117573">
+    <w:abstractNumId w:val="8"/>
   </w:num>
-  <w:num w:numId="6" w16cid:durableId="1208177020">
+  <w:num w:numId="11" w16cid:durableId="453329336">
+    <w:abstractNumId w:val="20"/>
+  </w:num>
+  <w:num w:numId="12" w16cid:durableId="1264922274">
+    <w:abstractNumId w:val="6"/>
+  </w:num>
+  <w:num w:numId="13" w16cid:durableId="2118019688">
+    <w:abstractNumId w:val="14"/>
+  </w:num>
+  <w:num w:numId="14" w16cid:durableId="1706254344">
+    <w:abstractNumId w:val="15"/>
+  </w:num>
+  <w:num w:numId="15" w16cid:durableId="1750887315">
+    <w:abstractNumId w:val="7"/>
+  </w:num>
+  <w:num w:numId="16" w16cid:durableId="367074461">
+    <w:abstractNumId w:val="21"/>
+  </w:num>
+  <w:num w:numId="17" w16cid:durableId="2126341168">
     <w:abstractNumId w:val="10"/>
   </w:num>
-  <w:num w:numId="7" w16cid:durableId="1032458305">
-    <w:abstractNumId w:val="9"/>
-  </w:num>
-  <w:num w:numId="8" w16cid:durableId="693846444">
-    <w:abstractNumId w:val="1"/>
-  </w:num>
-  <w:num w:numId="9" w16cid:durableId="527990408">
-    <w:abstractNumId w:val="14"/>
-  </w:num>
-  <w:num w:numId="10" w16cid:durableId="895117573">
-    <w:abstractNumId w:val="7"/>
-  </w:num>
-  <w:num w:numId="11" w16cid:durableId="453329336">
-    <w:abstractNumId w:val="15"/>
-  </w:num>
-  <w:num w:numId="12" w16cid:durableId="1264922274">
+  <w:num w:numId="18" w16cid:durableId="1761948115">
     <w:abstractNumId w:val="5"/>
-  </w:num>
-  <w:num w:numId="13" w16cid:durableId="2118019688">
-    <w:abstractNumId w:val="12"/>
-  </w:num>
-  <w:num w:numId="14" w16cid:durableId="1706254344">
-    <w:abstractNumId w:val="13"/>
-  </w:num>
-  <w:num w:numId="15" w16cid:durableId="1750887315">
-    <w:abstractNumId w:val="6"/>
-  </w:num>
-  <w:num w:numId="16" w16cid:durableId="367074461">
-    <w:abstractNumId w:val="16"/>
-  </w:num>
-  <w:num w:numId="17" w16cid:durableId="2126341168">
-    <w:abstractNumId w:val="8"/>
-  </w:num>
-  <w:num w:numId="18" w16cid:durableId="1761948115">
-    <w:abstractNumId w:val="4"/>
   </w:num>
   <w:num w:numId="19" w16cid:durableId="1091967395">
     <w:abstractNumId w:val="0"/>
+  </w:num>
+  <w:num w:numId="20" w16cid:durableId="1714695659">
+    <w:abstractNumId w:val="9"/>
+  </w:num>
+  <w:num w:numId="21" w16cid:durableId="451636447">
+    <w:abstractNumId w:val="19"/>
+  </w:num>
+  <w:num w:numId="22" w16cid:durableId="1733888049">
+    <w:abstractNumId w:val="16"/>
+  </w:num>
+  <w:num w:numId="23" w16cid:durableId="614825398">
+    <w:abstractNumId w:val="1"/>
+  </w:num>
+  <w:num w:numId="24" w16cid:durableId="80033787">
+    <w:abstractNumId w:val="17"/>
   </w:num>
 </w:numbering>
 </file>
@@ -8825,6 +10561,7 @@
   <w:style w:type="character" w:default="1" w:styleId="DefaultParagraphFont">
     <w:name w:val="Default Paragraph Font"/>
     <w:uiPriority w:val="1"/>
+    <w:semiHidden/>
     <w:unhideWhenUsed/>
   </w:style>
   <w:style w:type="table" w:default="1" w:styleId="TableNormal">

</xml_diff>